<commit_message>
fix: prophetes 6 corrections audit + docx régénéré + SW v1508
- J35 Ayyub: récit authentique (prospérité→Iblis→ruine→louange)
- J18 Lut: "fitra" remplace "contre nature"
- J47 Musa: "conseil" remplace "intercession"
- J51 Dawud: nuance tradition antérieure vs sources islamiques
- J68 Yahya: retrait §sang bouillant apocryphe
- J25 Yaqub: coupe réunion Égypte (doublon J32)

Co-Authored-By: Claude Opus 4.6 (1M context) <noreply@anthropic.com>
</commit_message>
<xml_diff>
--- a/ECRITS_NIYYAH/prophetes.docx
+++ b/ECRITS_NIYYAH/prophetes.docx
@@ -113,6 +113,19 @@
     </w:p>
     <w:p>
       <w:pPr>
+        <w:spacing w:after="60"/>
+      </w:pPr>
+      <w:r>
+        <w:rPr>
+          <w:rFonts w:ascii="Cormorant Garamond" w:cs="Cormorant Garamond" w:eastAsia="Cormorant Garamond" w:hAnsi="Cormorant Garamond"/>
+          <w:sz w:val="22"/>
+          <w:szCs w:val="22"/>
+        </w:rPr>
+        <w:t xml:space="preserve">L'homme est créé par Allah Lui-même, de Ses mains, par Son souffle. Cette dignité originelle précède tous nos actes : avant d'avoir fait quoi que ce soit, l'homme est déjà honoré.</w:t>
+      </w:r>
+    </w:p>
+    <w:p>
+      <w:pPr>
         <w:pBdr>
           <w:bottom w:val="single" w:color="CCCCCC" w:sz="1"/>
         </w:pBdr>
@@ -269,6 +282,19 @@
     </w:p>
     <w:p>
       <w:pPr>
+        <w:spacing w:after="60"/>
+      </w:pPr>
+      <w:r>
+        <w:rPr>
+          <w:rFonts w:ascii="Cormorant Garamond" w:cs="Cormorant Garamond" w:eastAsia="Cormorant Garamond" w:hAnsi="Cormorant Garamond"/>
+          <w:sz w:val="22"/>
+          <w:szCs w:val="22"/>
+        </w:rPr>
+        <w:t xml:space="preserve">L'orgueil est la première chute. Iblis n'a pas péché par appétit, mais par comparaison. Mesurer sa valeur à celle d'autrui est le poison le plus ancien de l'âme.</w:t>
+      </w:r>
+    </w:p>
+    <w:p>
+      <w:pPr>
         <w:pBdr>
           <w:bottom w:val="single" w:color="CCCCCC" w:sz="1"/>
         </w:pBdr>
@@ -438,6 +464,19 @@
     </w:p>
     <w:p>
       <w:pPr>
+        <w:spacing w:after="60"/>
+      </w:pPr>
+      <w:r>
+        <w:rPr>
+          <w:rFonts w:ascii="Cormorant Garamond" w:cs="Cormorant Garamond" w:eastAsia="Cormorant Garamond" w:hAnsi="Cormorant Garamond"/>
+          <w:sz w:val="22"/>
+          <w:szCs w:val="22"/>
+        </w:rPr>
+        <w:t xml:space="preserve">Adam incarne la grandeur du repentir. Il n'est pas le héros qui n'a jamais péché. Il est l'homme qui, après la faute, sait dire : j'ai eu tort, pardonne-moi. C'est cela, être un fils d'Adam.</w:t>
+      </w:r>
+    </w:p>
+    <w:p>
+      <w:pPr>
         <w:pBdr>
           <w:bottom w:val="single" w:color="CCCCCC" w:sz="1"/>
         </w:pBdr>
@@ -646,6 +685,19 @@
     </w:p>
     <w:p>
       <w:pPr>
+        <w:spacing w:after="60"/>
+      </w:pPr>
+      <w:r>
+        <w:rPr>
+          <w:rFonts w:ascii="Cormorant Garamond" w:cs="Cormorant Garamond" w:eastAsia="Cormorant Garamond" w:hAnsi="Cormorant Garamond"/>
+          <w:sz w:val="22"/>
+          <w:szCs w:val="22"/>
+        </w:rPr>
+        <w:t xml:space="preserve">Le premier crime n'est pas le vol, ni l'adultère, ni le mensonge. C'est le fratricide. La jalousie qui voit en l'autre non un frère, mais un rival. Habil enseigne la non-violence intérieure : préférer mourir innocent que vivre coupable.</w:t>
+      </w:r>
+    </w:p>
+    <w:p>
+      <w:pPr>
         <w:pBdr>
           <w:bottom w:val="single" w:color="CCCCCC" w:sz="1"/>
         </w:pBdr>
@@ -815,6 +867,19 @@
     </w:p>
     <w:p>
       <w:pPr>
+        <w:spacing w:after="60"/>
+      </w:pPr>
+      <w:r>
+        <w:rPr>
+          <w:rFonts w:ascii="Cormorant Garamond" w:cs="Cormorant Garamond" w:eastAsia="Cormorant Garamond" w:hAnsi="Cormorant Garamond"/>
+          <w:sz w:val="22"/>
+          <w:szCs w:val="22"/>
+        </w:rPr>
+        <w:t xml:space="preserve">Certaines vies pures ne se terminent pas — elles montent. Idris enseigne que l'élévation spirituelle peut transformer non seulement l'âme, mais le destin même du corps.</w:t>
+      </w:r>
+    </w:p>
+    <w:p>
+      <w:pPr>
         <w:pBdr>
           <w:bottom w:val="single" w:color="CCCCCC" w:sz="1"/>
         </w:pBdr>
@@ -971,6 +1036,19 @@
     </w:p>
     <w:p>
       <w:pPr>
+        <w:spacing w:after="60"/>
+      </w:pPr>
+      <w:r>
+        <w:rPr>
+          <w:rFonts w:ascii="Cormorant Garamond" w:cs="Cormorant Garamond" w:eastAsia="Cormorant Garamond" w:hAnsi="Cormorant Garamond"/>
+          <w:sz w:val="22"/>
+          <w:szCs w:val="22"/>
+        </w:rPr>
+        <w:t xml:space="preserve">Nuh enseigne la patience pure, sans fruit visible. Prêcher neuf siècles sans convertir personne, et continuer. La fidélité à Allah ne dépend pas du résultat.</w:t>
+      </w:r>
+    </w:p>
+    <w:p>
+      <w:pPr>
         <w:pBdr>
           <w:bottom w:val="single" w:color="CCCCCC" w:sz="1"/>
         </w:pBdr>
@@ -1153,6 +1231,19 @@
     </w:p>
     <w:p>
       <w:pPr>
+        <w:spacing w:after="60"/>
+      </w:pPr>
+      <w:r>
+        <w:rPr>
+          <w:rFonts w:ascii="Cormorant Garamond" w:cs="Cormorant Garamond" w:eastAsia="Cormorant Garamond" w:hAnsi="Cormorant Garamond"/>
+          <w:sz w:val="22"/>
+          <w:szCs w:val="22"/>
+        </w:rPr>
+        <w:t xml:space="preserve">Obéir à Allah avant qu'on ne voie la raison. Nuh a construit son arche dans le sec, sans une goutte d'eau en vue. La foi, c'est faire confiance à l'ordre avant la pluie.</w:t>
+      </w:r>
+    </w:p>
+    <w:p>
+      <w:pPr>
         <w:pBdr>
           <w:bottom w:val="single" w:color="CCCCCC" w:sz="1"/>
         </w:pBdr>
@@ -1335,6 +1426,19 @@
     </w:p>
     <w:p>
       <w:pPr>
+        <w:spacing w:after="60"/>
+      </w:pPr>
+      <w:r>
+        <w:rPr>
+          <w:rFonts w:ascii="Cormorant Garamond" w:cs="Cormorant Garamond" w:eastAsia="Cormorant Garamond" w:hAnsi="Cormorant Garamond"/>
+          <w:sz w:val="22"/>
+          <w:szCs w:val="22"/>
+        </w:rPr>
+        <w:t xml:space="preserve">Nuh apprend la leçon la plus dure : la guidance ne s'hérite pas. On peut être prophète et avoir un fils mécréant. La foi est un choix personnel qu'aucun amour paternel ne peut imposer.</w:t>
+      </w:r>
+    </w:p>
+    <w:p>
+      <w:pPr>
         <w:pBdr>
           <w:bottom w:val="single" w:color="CCCCCC" w:sz="1"/>
         </w:pBdr>
@@ -1543,6 +1647,19 @@
     </w:p>
     <w:p>
       <w:pPr>
+        <w:spacing w:after="60"/>
+      </w:pPr>
+      <w:r>
+        <w:rPr>
+          <w:rFonts w:ascii="Cormorant Garamond" w:cs="Cormorant Garamond" w:eastAsia="Cormorant Garamond" w:hAnsi="Cormorant Garamond"/>
+          <w:sz w:val="22"/>
+          <w:szCs w:val="22"/>
+        </w:rPr>
+        <w:t xml:space="preserve">L'orgueil de la civilisation puissante est l'aveuglement le plus dur à percer. Quand on se croit invincible, on cesse de se croire créé.</w:t>
+      </w:r>
+    </w:p>
+    <w:p>
+      <w:pPr>
         <w:pBdr>
           <w:bottom w:val="single" w:color="CCCCCC" w:sz="1"/>
         </w:pBdr>
@@ -1751,6 +1868,19 @@
     </w:p>
     <w:p>
       <w:pPr>
+        <w:spacing w:after="60"/>
+      </w:pPr>
+      <w:r>
+        <w:rPr>
+          <w:rFonts w:ascii="Cormorant Garamond" w:cs="Cormorant Garamond" w:eastAsia="Cormorant Garamond" w:hAnsi="Cormorant Garamond"/>
+          <w:sz w:val="22"/>
+          <w:szCs w:val="22"/>
+        </w:rPr>
+        <w:t xml:space="preserve">Aucune civilisation, si puissante soit-elle, n'est éternelle quand elle oublie Allah. Le vent suffit. Pas une armée. Pas un séisme spectaculaire. Un vent.</w:t>
+      </w:r>
+    </w:p>
+    <w:p>
+      <w:pPr>
         <w:pBdr>
           <w:bottom w:val="single" w:color="CCCCCC" w:sz="1"/>
         </w:pBdr>
@@ -1972,6 +2102,19 @@
     </w:p>
     <w:p>
       <w:pPr>
+        <w:spacing w:after="60"/>
+      </w:pPr>
+      <w:r>
+        <w:rPr>
+          <w:rFonts w:ascii="Cormorant Garamond" w:cs="Cormorant Garamond" w:eastAsia="Cormorant Garamond" w:hAnsi="Cormorant Garamond"/>
+          <w:sz w:val="22"/>
+          <w:szCs w:val="22"/>
+        </w:rPr>
+        <w:t xml:space="preserve">Allah ne refuse jamais un signe demandé sincèrement. Mais le signe ne convertit pas le cœur fermé. Seul un cœur ouvert reconnaît ce qu'il voit.</w:t>
+      </w:r>
+    </w:p>
+    <w:p>
+      <w:pPr>
         <w:pBdr>
           <w:bottom w:val="single" w:color="CCCCCC" w:sz="1"/>
         </w:pBdr>
@@ -2219,6 +2362,19 @@
     </w:p>
     <w:p>
       <w:pPr>
+        <w:spacing w:after="60"/>
+      </w:pPr>
+      <w:r>
+        <w:rPr>
+          <w:rFonts w:ascii="Cormorant Garamond" w:cs="Cormorant Garamond" w:eastAsia="Cormorant Garamond" w:hAnsi="Cormorant Garamond"/>
+          <w:sz w:val="22"/>
+          <w:szCs w:val="22"/>
+        </w:rPr>
+        <w:t xml:space="preserve">Le miracle n'est jamais l'argument définitif. C'est toujours le cœur qui décide. Les Thamud ont vu la chamelle sortir de la pierre — et ils ont quand même fini par lui trancher les jarrets.</w:t>
+      </w:r>
+    </w:p>
+    <w:p>
+      <w:pPr>
         <w:pBdr>
           <w:bottom w:val="single" w:color="CCCCCC" w:sz="1"/>
         </w:pBdr>
@@ -2388,6 +2544,19 @@
     </w:p>
     <w:p>
       <w:pPr>
+        <w:spacing w:after="60"/>
+      </w:pPr>
+      <w:r>
+        <w:rPr>
+          <w:rFonts w:ascii="Cormorant Garamond" w:cs="Cormorant Garamond" w:eastAsia="Cormorant Garamond" w:hAnsi="Cormorant Garamond"/>
+          <w:sz w:val="22"/>
+          <w:szCs w:val="22"/>
+        </w:rPr>
+        <w:t xml:space="preserve">La foi véritable ne s'hérite pas. Ibrahim a trouvé Allah seul, par la raison, en éliminant tout ce qui se couche. C'est la fitra : la capacité originelle de chaque être humain à reconnaître son Créateur s'il regarde sincèrement.</w:t>
+      </w:r>
+    </w:p>
+    <w:p>
+      <w:pPr>
         <w:pBdr>
           <w:bottom w:val="single" w:color="CCCCCC" w:sz="1"/>
         </w:pBdr>
@@ -2583,6 +2752,19 @@
     </w:p>
     <w:p>
       <w:pPr>
+        <w:spacing w:after="60"/>
+      </w:pPr>
+      <w:r>
+        <w:rPr>
+          <w:rFonts w:ascii="Cormorant Garamond" w:cs="Cormorant Garamond" w:eastAsia="Cormorant Garamond" w:hAnsi="Cormorant Garamond"/>
+          <w:sz w:val="22"/>
+          <w:szCs w:val="22"/>
+        </w:rPr>
+        <w:t xml:space="preserve">L'argument le plus puissant contre le faux n'est pas toujours le discours. Parfois, c'est un geste. Ibrahim ne discute pas — il révèle l'absurdité par l'absurde. Et les hommes sont forcés de voir.</w:t>
+      </w:r>
+    </w:p>
+    <w:p>
+      <w:pPr>
         <w:pBdr>
           <w:bottom w:val="single" w:color="CCCCCC" w:sz="1"/>
         </w:pBdr>
@@ -2778,6 +2960,19 @@
     </w:p>
     <w:p>
       <w:pPr>
+        <w:spacing w:after="60"/>
+      </w:pPr>
+      <w:r>
+        <w:rPr>
+          <w:rFonts w:ascii="Cormorant Garamond" w:cs="Cormorant Garamond" w:eastAsia="Cormorant Garamond" w:hAnsi="Cormorant Garamond"/>
+          <w:sz w:val="22"/>
+          <w:szCs w:val="22"/>
+        </w:rPr>
+        <w:t xml:space="preserve">Quand tout le monde s'unit contre toi et que tu es seul avec Allah, tu es la majorité. Le feu lui-même n'obéit qu'à son Créateur — pas à la haine des hommes.</w:t>
+      </w:r>
+    </w:p>
+    <w:p>
+      <w:pPr>
         <w:pBdr>
           <w:bottom w:val="single" w:color="CCCCCC" w:sz="1"/>
         </w:pBdr>
@@ -2986,6 +3181,19 @@
     </w:p>
     <w:p>
       <w:pPr>
+        <w:spacing w:after="60"/>
+      </w:pPr>
+      <w:r>
+        <w:rPr>
+          <w:rFonts w:ascii="Cormorant Garamond" w:cs="Cormorant Garamond" w:eastAsia="Cormorant Garamond" w:hAnsi="Cormorant Garamond"/>
+          <w:sz w:val="22"/>
+          <w:szCs w:val="22"/>
+        </w:rPr>
+        <w:t xml:space="preserve">La foi d'Hagar fonde la cité sacrée de l'islam. Pas la foi d'un prophète — la foi d'une mère qui dit : si c'est Allah, alors Il ne nous abandonnera pas. Toute l'umma marche encore aujourd'hui entre ses deux collines.</w:t>
+      </w:r>
+    </w:p>
+    <w:p>
+      <w:pPr>
         <w:pBdr>
           <w:bottom w:val="single" w:color="CCCCCC" w:sz="1"/>
         </w:pBdr>
@@ -3207,6 +3415,19 @@
     </w:p>
     <w:p>
       <w:pPr>
+        <w:spacing w:after="60"/>
+      </w:pPr>
+      <w:r>
+        <w:rPr>
+          <w:rFonts w:ascii="Cormorant Garamond" w:cs="Cormorant Garamond" w:eastAsia="Cormorant Garamond" w:hAnsi="Cormorant Garamond"/>
+          <w:sz w:val="22"/>
+          <w:szCs w:val="22"/>
+        </w:rPr>
+        <w:t xml:space="preserve">Ibrahim n'est pas le héros qui réussit. C'est celui qui obéit. Il a tout perdu — son père, sa cité, presque son fils — et il a tout reçu : la Maison sacrée, une descendance innombrable, le titre d'Ami d'Allah. L'obéissance pure est la voie royale.</w:t>
+      </w:r>
+    </w:p>
+    <w:p>
+      <w:pPr>
         <w:pBdr>
           <w:bottom w:val="single" w:color="CCCCCC" w:sz="1"/>
         </w:pBdr>
@@ -3293,7 +3514,7 @@
           <w:sz w:val="22"/>
           <w:szCs w:val="22"/>
         </w:rPr>
-        <w:t xml:space="preserve">Les hommes de Sodome avaient abandonné les femmes pour les hommes. Ils approchaient leurs semblables dans le sens contre nature. Ils faisaient cela ouvertement, dans leurs assemblées, sans honte, en riant. Et ils ne se contentaient pas de cela entre eux. Ils guettaient les caravanes qui traversaient leur région. Ils tendaient des pièges aux voyageurs. Quand un étranger passait — surtout s'il était jeune et beau — la foule l'entourait, l'arrachait à ses compagnons, l'humiliait. C'était devenu une coutume. Un sport. Une fierté locale.</w:t>
+        <w:t xml:space="preserve">Les hommes de Sodome avaient abandonné les femmes pour les hommes. Ils approchaient leurs semblables contrairement à la fitra qu'Allah a créée. Ils faisaient cela ouvertement, dans leurs assemblées, sans honte, en riant. Et ils ne se contentaient pas de cela entre eux. Ils guettaient les caravanes qui traversaient leur région. Ils tendaient des pièges aux voyageurs. Quand un étranger passait — surtout s'il était jeune et beau — la foule l'entourait, l'arrachait à ses compagnons, l'humiliait. C'était devenu une coutume. Un sport. Une fierté locale.</w:t>
       </w:r>
     </w:p>
     <w:p>
@@ -3372,6 +3593,19 @@
           <w:szCs w:val="22"/>
         </w:rPr>
         <w:t xml:space="preserve">Vous vous adonnez à une turpitude qu'aucun être au monde n'a commise avant vous.</w:t>
+      </w:r>
+    </w:p>
+    <w:p>
+      <w:pPr>
+        <w:spacing w:after="60"/>
+      </w:pPr>
+      <w:r>
+        <w:rPr>
+          <w:rFonts w:ascii="Cormorant Garamond" w:cs="Cormorant Garamond" w:eastAsia="Cormorant Garamond" w:hAnsi="Cormorant Garamond"/>
+          <w:sz w:val="22"/>
+          <w:szCs w:val="22"/>
+        </w:rPr>
+        <w:t xml:space="preserve">Quand une société entière inverse le bien et le mal, le prophète ne peut plus que la confronter. Lut enseigne la solitude du juste dans une cité corrompue : ne pas céder, même quand on est seul.</w:t>
       </w:r>
     </w:p>
     <w:p>
@@ -3636,6 +3870,19 @@
     </w:p>
     <w:p>
       <w:pPr>
+        <w:spacing w:after="60"/>
+      </w:pPr>
+      <w:r>
+        <w:rPr>
+          <w:rFonts w:ascii="Cormorant Garamond" w:cs="Cormorant Garamond" w:eastAsia="Cormorant Garamond" w:hAnsi="Cormorant Garamond"/>
+          <w:sz w:val="22"/>
+          <w:szCs w:val="22"/>
+        </w:rPr>
+        <w:t xml:space="preserve">Quand une société entière inverse le bien et le mal, c'est elle qui finit à l'envers. La Mer Morte est encore là, au point le plus bas de la terre, témoin silencieux du décret divin.</w:t>
+      </w:r>
+    </w:p>
+    <w:p>
+      <w:pPr>
         <w:pBdr>
           <w:bottom w:val="single" w:color="CCCCCC" w:sz="1"/>
         </w:pBdr>
@@ -3818,6 +4065,19 @@
     </w:p>
     <w:p>
       <w:pPr>
+        <w:spacing w:after="60"/>
+      </w:pPr>
+      <w:r>
+        <w:rPr>
+          <w:rFonts w:ascii="Cormorant Garamond" w:cs="Cormorant Garamond" w:eastAsia="Cormorant Garamond" w:hAnsi="Cormorant Garamond"/>
+          <w:sz w:val="22"/>
+          <w:szCs w:val="22"/>
+        </w:rPr>
+        <w:t xml:space="preserve">Ismail incarne la patience d'un enfant qui grandit sans ses repères. Élevé dans le manque, il devient pourtant l'ancêtre d'une lignée que personne dans la vallée n'aurait pu prévoir. Allah élève qui Il veut, où Il veut.</w:t>
+      </w:r>
+    </w:p>
+    <w:p>
+      <w:pPr>
         <w:pBdr>
           <w:bottom w:val="single" w:color="CCCCCC" w:sz="1"/>
         </w:pBdr>
@@ -4091,6 +4351,19 @@
     </w:p>
     <w:p>
       <w:pPr>
+        <w:spacing w:after="60"/>
+      </w:pPr>
+      <w:r>
+        <w:rPr>
+          <w:rFonts w:ascii="Cormorant Garamond" w:cs="Cormorant Garamond" w:eastAsia="Cormorant Garamond" w:hAnsi="Cormorant Garamond"/>
+          <w:sz w:val="22"/>
+          <w:szCs w:val="22"/>
+        </w:rPr>
+        <w:t xml:space="preserve">L'obéissance d'un enfant peut dépasser celle des sages. Ismail accepte non parce qu'il est faible, mais parce qu'il a compris. La vraie soumission n'est pas le servage : c'est le choix lucide de dire oui à Allah même quand cela coûte tout.</w:t>
+      </w:r>
+    </w:p>
+    <w:p>
+      <w:pPr>
         <w:pBdr>
           <w:bottom w:val="single" w:color="CCCCCC" w:sz="1"/>
         </w:pBdr>
@@ -4338,6 +4611,19 @@
     </w:p>
     <w:p>
       <w:pPr>
+        <w:spacing w:after="60"/>
+      </w:pPr>
+      <w:r>
+        <w:rPr>
+          <w:rFonts w:ascii="Cormorant Garamond" w:cs="Cormorant Garamond" w:eastAsia="Cormorant Garamond" w:hAnsi="Cormorant Garamond"/>
+          <w:sz w:val="22"/>
+          <w:szCs w:val="22"/>
+        </w:rPr>
+        <w:t xml:space="preserve">Allah donne quand toute la nature a dit non. Ishaq est l'enfant de l'impossible — preuve incarnée que les promesses divines ne dépendent ni du temps qui passe, ni du corps qui vieillit. Il n'est jamais trop tard pour ce qu'Allah a décrété.</w:t>
+      </w:r>
+    </w:p>
+    <w:p>
+      <w:pPr>
         <w:pBdr>
           <w:bottom w:val="single" w:color="CCCCCC" w:sz="1"/>
         </w:pBdr>
@@ -4494,6 +4780,19 @@
     </w:p>
     <w:p>
       <w:pPr>
+        <w:spacing w:after="60"/>
+      </w:pPr>
+      <w:r>
+        <w:rPr>
+          <w:rFonts w:ascii="Cormorant Garamond" w:cs="Cormorant Garamond" w:eastAsia="Cormorant Garamond" w:hAnsi="Cormorant Garamond"/>
+          <w:sz w:val="22"/>
+          <w:szCs w:val="22"/>
+        </w:rPr>
+        <w:t xml:space="preserve">La promesse d'Allah passe par qui elle veut, parfois par le second-né, parfois par le plus doux. Yaqub n'a pas conquis sa place — elle lui a été donnée, et il l'a portée.</w:t>
+      </w:r>
+    </w:p>
+    <w:p>
+      <w:pPr>
         <w:pBdr>
           <w:bottom w:val="single" w:color="CCCCCC" w:sz="1"/>
         </w:pBdr>
@@ -4650,6 +4949,19 @@
     </w:p>
     <w:p>
       <w:pPr>
+        <w:spacing w:after="60"/>
+      </w:pPr>
+      <w:r>
+        <w:rPr>
+          <w:rFonts w:ascii="Cormorant Garamond" w:cs="Cormorant Garamond" w:eastAsia="Cormorant Garamond" w:hAnsi="Cormorant Garamond"/>
+          <w:sz w:val="22"/>
+          <w:szCs w:val="22"/>
+        </w:rPr>
+        <w:t xml:space="preserve">Aucune famille de prophète n'est sans tension. Yaqub vit, dans sa propre tente, l'inégalité d'amour qui prépare les drames. La famille est un don, mais aussi une épreuve qui se prolonge à travers les générations.</w:t>
+      </w:r>
+    </w:p>
+    <w:p>
+      <w:pPr>
         <w:pBdr>
           <w:bottom w:val="single" w:color="CCCCCC" w:sz="1"/>
         </w:pBdr>
@@ -4801,85 +5113,20 @@
           <w:sz w:val="22"/>
           <w:szCs w:val="22"/>
         </w:rPr>
-        <w:t xml:space="preserve">Un jour vint la famine. Une famine terrible qui dura sept ans, étendue sur toute la région. Les fils de Yaqub, eux aussi, durent partir chercher du grain en Égypte, où le pharaon avait fait stocker des réserves. Ils y allèrent une fois. Puis une seconde fois, accompagnés de Benjamin cette fois — leur demi-frère cadet, l'autre fils de Rachel, le seul qui restait à Yaqub. Quand ils revinrent de cette seconde expédition, ils n'étaient pas seulement chargés de grain. Ils portaient une nouvelle.</w:t>
-      </w:r>
-    </w:p>
-    <w:p>
-      <w:pPr>
-        <w:spacing w:after="60"/>
-      </w:pPr>
-      <w:r>
-        <w:rPr>
-          <w:rFonts w:ascii="Cormorant Garamond" w:cs="Cormorant Garamond" w:eastAsia="Cormorant Garamond" w:hAnsi="Cormorant Garamond"/>
-          <w:sz w:val="22"/>
-          <w:szCs w:val="22"/>
-        </w:rPr>
-        <w:t xml:space="preserve">Leur petit frère perdu, Yusuf, vivait. Il était ministre d'Égypte. Il les avait reconnus. Il les avait pardonnés. Et il leur avait donné, pour leur père, sa propre chemise — celle qu'il portait sur son corps.</w:t>
-      </w:r>
-    </w:p>
-    <w:p>
-      <w:pPr>
-        <w:spacing w:after="60"/>
-      </w:pPr>
-      <w:r>
-        <w:rPr>
-          <w:rFonts w:ascii="Cormorant Garamond" w:cs="Cormorant Garamond" w:eastAsia="Cormorant Garamond" w:hAnsi="Cormorant Garamond"/>
-          <w:sz w:val="22"/>
-          <w:szCs w:val="22"/>
-        </w:rPr>
-        <w:t xml:space="preserve">Yaqub était assis dans sa tente, à des journées de marche de l'Égypte. La caravane n'était pas encore en vue. Et soudain, il leva la tête. Il dit, à sa famille présente : Je sens l'odeur de Yusuf. Si vous n'alliez pas me traiter de radoteur. On le prit pour un vieillard égaré. On dit : Par Allah, te voilà encore dans ton ancien égarement. Mais quelques jours plus tard, la caravane arriva. Le messager le plus rapide courut en avant, portant la chemise. Il la jeta sur le visage de Yaqub.</w:t>
-      </w:r>
-    </w:p>
-    <w:p>
-      <w:pPr>
-        <w:spacing w:after="60"/>
-      </w:pPr>
-      <w:r>
-        <w:rPr>
-          <w:rFonts w:ascii="Cormorant Garamond" w:cs="Cormorant Garamond" w:eastAsia="Cormorant Garamond" w:hAnsi="Cormorant Garamond"/>
-          <w:sz w:val="22"/>
-          <w:szCs w:val="22"/>
-        </w:rPr>
-        <w:t xml:space="preserve">Et Yaqub vit. Il vit vraiment. Ses yeux, blanchis par trente ans de larmes, retrouvèrent la lumière. Il se redressa. Il dit, comme on annonce une victoire après une longue guerre : Ne vous avais-je pas dit que je sais d'Allah ce que vous ne savez pas ?</w:t>
-      </w:r>
-    </w:p>
-    <w:p>
-      <w:pPr>
-        <w:spacing w:after="60"/>
-      </w:pPr>
-      <w:r>
-        <w:rPr>
-          <w:rFonts w:ascii="Cormorant Garamond" w:cs="Cormorant Garamond" w:eastAsia="Cormorant Garamond" w:hAnsi="Cormorant Garamond"/>
-          <w:sz w:val="22"/>
-          <w:szCs w:val="22"/>
-        </w:rPr>
-        <w:t xml:space="preserve">La famille se rassembla. Yaqub, ses fils, sa bru, ses petits-enfants — tous descendirent en Égypte rejoindre Yusuf. Yusuf vint à leur rencontre. Il fit asseoir son père sur le trône à côté de lui. Les onze frères se prosternèrent devant Yusuf. Et Yusuf dit : Mon père, voici l'interprétation de mon rêve d'autrefois. Allah l'a réalisée.</w:t>
-      </w:r>
-    </w:p>
-    <w:p>
-      <w:pPr>
-        <w:spacing w:after="60"/>
-      </w:pPr>
-      <w:r>
-        <w:rPr>
-          <w:rFonts w:ascii="Cormorant Garamond" w:cs="Cormorant Garamond" w:eastAsia="Cormorant Garamond" w:hAnsi="Cormorant Garamond"/>
-          <w:sz w:val="22"/>
-          <w:szCs w:val="22"/>
-        </w:rPr>
-        <w:t xml:space="preserve">Yaqub vécut encore quelques années en Égypte. Il y mourut paisible, entouré de sa famille enfin réunie. Avant de mourir, il assembla ses fils et leur fit jurer de continuer à adorer Allah seul. Le Coran l'enregistre : Qu'adorerez-vous après moi ? Ils répondirent : Nous adorerons ta divinité et la divinité de tes pères, Ibrahim, Ismail et Ishaq, divinité unique, et à Lui nous sommes soumis.</w:t>
-      </w:r>
-    </w:p>
-    <w:p>
-      <w:pPr>
-        <w:spacing w:after="60"/>
-      </w:pPr>
-      <w:r>
-        <w:rPr>
-          <w:rFonts w:ascii="Cormorant Garamond" w:cs="Cormorant Garamond" w:eastAsia="Cormorant Garamond" w:hAnsi="Cormorant Garamond"/>
-          <w:sz w:val="22"/>
-          <w:szCs w:val="22"/>
-        </w:rPr>
-        <w:t xml:space="preserve">Il ferma les yeux en paix. Son corps fut, selon son vœu, ramené à Hébron — auprès de son père Ishaq, auprès de son grand-père Ibrahim, dans la caverne de Makhpela. Trois générations de patriarches dans la même terre.</w:t>
+        <w:t xml:space="preserve">C'est dans cette attente que se déploie la grandeur de Yaqub. Pas dans un miracle spectaculaire. Pas dans une victoire militaire. Dans la patience d'un père aveugle qui refuse de cesser d'espérer. Il dit à Allah ce qu'il ne dit à personne : sa douleur. Et il garde pour les hommes un visage de dignité.</w:t>
+      </w:r>
+    </w:p>
+    <w:p>
+      <w:pPr>
+        <w:spacing w:after="60"/>
+      </w:pPr>
+      <w:r>
+        <w:rPr>
+          <w:rFonts w:ascii="Cormorant Garamond" w:cs="Cormorant Garamond" w:eastAsia="Cormorant Garamond" w:hAnsi="Cormorant Garamond"/>
+          <w:sz w:val="22"/>
+          <w:szCs w:val="22"/>
+        </w:rPr>
+        <w:t xml:space="preserve">La suite — la famine, le voyage des fils en Égypte, les retrouvailles avec Yusuf, la chemise qui rend la vue — appartient au récit de Yusuf. Mais ce qu'il faut retenir de Yaqub, c'est ces années de nuit. Ces années où il ne voyait plus rien, sauf la certitude qu'Allah tient Ses promesses. Même quand les yeux ne voient plus, le cœur du prophète continue de voir.</w:t>
       </w:r>
     </w:p>
     <w:p>
@@ -4893,6 +5140,19 @@
           <w:szCs w:val="22"/>
         </w:rPr>
         <w:t xml:space="preserve">Belle patience est la mienne. C'est Allah qu'il faut prier contre ce que vous décrivez. Je ne me plains qu'à Allah.</w:t>
+      </w:r>
+    </w:p>
+    <w:p>
+      <w:pPr>
+        <w:spacing w:after="60"/>
+      </w:pPr>
+      <w:r>
+        <w:rPr>
+          <w:rFonts w:ascii="Cormorant Garamond" w:cs="Cormorant Garamond" w:eastAsia="Cormorant Garamond" w:hAnsi="Cormorant Garamond"/>
+          <w:sz w:val="22"/>
+          <w:szCs w:val="22"/>
+        </w:rPr>
+        <w:t xml:space="preserve">Yaqub enseigne la patience qui ne se plaint qu'à Allah. Pendant trente ans, il a porté la douleur d'un fils perdu sans se laisser ronger par la haine envers ceux qui le lui avaient pris. Sa patience était belle parce qu'elle restait tournée vers le Ciel.</w:t>
       </w:r>
     </w:p>
     <w:p>
@@ -5131,6 +5391,19 @@
     </w:p>
     <w:p>
       <w:pPr>
+        <w:spacing w:after="60"/>
+      </w:pPr>
+      <w:r>
+        <w:rPr>
+          <w:rFonts w:ascii="Cormorant Garamond" w:cs="Cormorant Garamond" w:eastAsia="Cormorant Garamond" w:hAnsi="Cormorant Garamond"/>
+          <w:sz w:val="22"/>
+          <w:szCs w:val="22"/>
+        </w:rPr>
+        <w:t xml:space="preserve">Le rêve d'un enfant peut suffire à allumer un destin — ou à éveiller la jalousie qui détruit. Yaqub savait. Et pourtant, l'histoire devait suivre son cours, parce qu'Allah écrit avec des cycles que nous ne voyons qu'à la fin.</w:t>
+      </w:r>
+    </w:p>
+    <w:p>
+      <w:pPr>
         <w:pBdr>
           <w:bottom w:val="single" w:color="CCCCCC" w:sz="1"/>
         </w:pBdr>
@@ -5339,6 +5612,19 @@
     </w:p>
     <w:p>
       <w:pPr>
+        <w:spacing w:after="60"/>
+      </w:pPr>
+      <w:r>
+        <w:rPr>
+          <w:rFonts w:ascii="Cormorant Garamond" w:cs="Cormorant Garamond" w:eastAsia="Cormorant Garamond" w:hAnsi="Cormorant Garamond"/>
+          <w:sz w:val="22"/>
+          <w:szCs w:val="22"/>
+        </w:rPr>
+        <w:t xml:space="preserve">Le fond du puits n'est jamais le fond de l'histoire. Allah parle parfois à Ses serviteurs au moment exact où tous les hommes les ont abandonnés. Ce qui ressemble à la fin n'est souvent que le début.</w:t>
+      </w:r>
+    </w:p>
+    <w:p>
+      <w:pPr>
         <w:pBdr>
           <w:bottom w:val="single" w:color="CCCCCC" w:sz="1"/>
         </w:pBdr>
@@ -5586,6 +5872,19 @@
     </w:p>
     <w:p>
       <w:pPr>
+        <w:spacing w:after="60"/>
+      </w:pPr>
+      <w:r>
+        <w:rPr>
+          <w:rFonts w:ascii="Cormorant Garamond" w:cs="Cormorant Garamond" w:eastAsia="Cormorant Garamond" w:hAnsi="Cormorant Garamond"/>
+          <w:sz w:val="22"/>
+          <w:szCs w:val="22"/>
+        </w:rPr>
+        <w:t xml:space="preserve">Yusuf préfère la prison au péché. Il n'y a pas plus haute parole dans la sourate. Celui qui se purifie par refus volontaire dépasse celui qui se purifie par incapacité.</w:t>
+      </w:r>
+    </w:p>
+    <w:p>
+      <w:pPr>
         <w:pBdr>
           <w:bottom w:val="single" w:color="CCCCCC" w:sz="1"/>
         </w:pBdr>
@@ -5807,6 +6106,19 @@
     </w:p>
     <w:p>
       <w:pPr>
+        <w:spacing w:after="60"/>
+      </w:pPr>
+      <w:r>
+        <w:rPr>
+          <w:rFonts w:ascii="Cormorant Garamond" w:cs="Cormorant Garamond" w:eastAsia="Cormorant Garamond" w:hAnsi="Cormorant Garamond"/>
+          <w:sz w:val="22"/>
+          <w:szCs w:val="22"/>
+        </w:rPr>
+        <w:t xml:space="preserve">Même prisonnier, le prophète prêche. Yusuf ne perd pas une occasion d'orienter les cœurs vers Allah. Et il apprend, dans la longueur du temps, que l'aide véritable ne vient jamais des hommes.</w:t>
+      </w:r>
+    </w:p>
+    <w:p>
+      <w:pPr>
         <w:pBdr>
           <w:bottom w:val="single" w:color="CCCCCC" w:sz="1"/>
         </w:pBdr>
@@ -6041,6 +6353,19 @@
     </w:p>
     <w:p>
       <w:pPr>
+        <w:spacing w:after="60"/>
+      </w:pPr>
+      <w:r>
+        <w:rPr>
+          <w:rFonts w:ascii="Cormorant Garamond" w:cs="Cormorant Garamond" w:eastAsia="Cormorant Garamond" w:hAnsi="Cormorant Garamond"/>
+          <w:sz w:val="22"/>
+          <w:szCs w:val="22"/>
+        </w:rPr>
+        <w:t xml:space="preserve">Yusuf ne sort de prison qu'après que son honneur ait été publiquement lavé. La dignité n'est pas l'orgueil — c'est l'exigence que la vérité soit dite, même quand on aurait avantage à la taire.</w:t>
+      </w:r>
+    </w:p>
+    <w:p>
+      <w:pPr>
         <w:pBdr>
           <w:bottom w:val="single" w:color="CCCCCC" w:sz="1"/>
         </w:pBdr>
@@ -6340,6 +6665,19 @@
     </w:p>
     <w:p>
       <w:pPr>
+        <w:spacing w:after="60"/>
+      </w:pPr>
+      <w:r>
+        <w:rPr>
+          <w:rFonts w:ascii="Cormorant Garamond" w:cs="Cormorant Garamond" w:eastAsia="Cormorant Garamond" w:hAnsi="Cormorant Garamond"/>
+          <w:sz w:val="22"/>
+          <w:szCs w:val="22"/>
+        </w:rPr>
+        <w:t xml:space="preserve">Allah écrit avec des cycles que nous ne voyons qu'à la fin. Vingt ans pour un rêve. Le rêve d'enfant que les frères avaient voulu effacer s'accomplit devant leurs yeux : ils se prosternèrent.</w:t>
+      </w:r>
+    </w:p>
+    <w:p>
+      <w:pPr>
         <w:pBdr>
           <w:bottom w:val="single" w:color="CCCCCC" w:sz="1"/>
         </w:pBdr>
@@ -6613,6 +6951,19 @@
     </w:p>
     <w:p>
       <w:pPr>
+        <w:spacing w:after="60"/>
+      </w:pPr>
+      <w:r>
+        <w:rPr>
+          <w:rFonts w:ascii="Cormorant Garamond" w:cs="Cormorant Garamond" w:eastAsia="Cormorant Garamond" w:hAnsi="Cormorant Garamond"/>
+          <w:sz w:val="22"/>
+          <w:szCs w:val="22"/>
+        </w:rPr>
+        <w:t xml:space="preserve">Le pardon complet est l'œuvre la plus haute de l'homme. Yusuf avait le pouvoir, la mémoire, le motif. Il choisit le pardon, parce qu'il avait compris que toute son histoire avait été écrite pour aboutir à ce moment précis.</w:t>
+      </w:r>
+    </w:p>
+    <w:p>
+      <w:pPr>
         <w:pBdr>
           <w:bottom w:val="single" w:color="CCCCCC" w:sz="1"/>
         </w:pBdr>
@@ -6821,6 +7172,19 @@
     </w:p>
     <w:p>
       <w:pPr>
+        <w:spacing w:after="60"/>
+      </w:pPr>
+      <w:r>
+        <w:rPr>
+          <w:rFonts w:ascii="Cormorant Garamond" w:cs="Cormorant Garamond" w:eastAsia="Cormorant Garamond" w:hAnsi="Cormorant Garamond"/>
+          <w:sz w:val="22"/>
+          <w:szCs w:val="22"/>
+        </w:rPr>
+        <w:t xml:space="preserve">Le péché ordinaire — celui qui ne fait pas de bruit, qui s'incruste dans le geste quotidien du commerçant — peut perdre tout un peuple. Voler un gramme à un client est un péché qu'une nation entière ne peut pas porter à l'échelle des générations.</w:t>
+      </w:r>
+    </w:p>
+    <w:p>
+      <w:pPr>
         <w:pBdr>
           <w:bottom w:val="single" w:color="CCCCCC" w:sz="1"/>
         </w:pBdr>
@@ -7055,6 +7419,19 @@
     </w:p>
     <w:p>
       <w:pPr>
+        <w:spacing w:after="60"/>
+      </w:pPr>
+      <w:r>
+        <w:rPr>
+          <w:rFonts w:ascii="Cormorant Garamond" w:cs="Cormorant Garamond" w:eastAsia="Cormorant Garamond" w:hAnsi="Cormorant Garamond"/>
+          <w:sz w:val="22"/>
+          <w:szCs w:val="22"/>
+        </w:rPr>
+        <w:t xml:space="preserve">Le séisme et le Cri descendent sur ceux qui rognent les balances. Allah ne juge pas seulement les grands crimes spectaculaires — Il juge aussi les petites tromperies quotidiennes qui finissent par pourrir une civilisation entière.</w:t>
+      </w:r>
+    </w:p>
+    <w:p>
+      <w:pPr>
         <w:pBdr>
           <w:bottom w:val="single" w:color="CCCCCC" w:sz="1"/>
         </w:pBdr>
@@ -7089,33 +7466,332 @@
           <w:sz w:val="20"/>
           <w:szCs w:val="20"/>
         </w:rPr>
-        <w:t xml:space="preserve">Coran 37:99-107</w:t>
-      </w:r>
-    </w:p>
-    <w:p>
-      <w:pPr>
-        <w:spacing w:after="60"/>
-      </w:pPr>
-      <w:r>
-        <w:rPr>
-          <w:rFonts w:ascii="Cormorant Garamond" w:cs="Cormorant Garamond" w:eastAsia="Cormorant Garamond" w:hAnsi="Cormorant Garamond"/>
-          <w:sz w:val="22"/>
-          <w:szCs w:val="22"/>
-        </w:rPr>
-        <w:t xml:space="preserve">Ibrâhîm voit en songe qu’il sacrifie son fils. Trois nuits de suite. Pour un prophète, le songe est révélation. Il en parle à Ismâ’îl. L’enfant — adolescent — répond : « Ô mon père, fais ce qui t’es ordonné. Tu me trouveras patient, si Allâh le veut. » (37:102). Ils partent ensemble vers Minâ. Au moment où Ibrâhîm pose son fils sur le front, prêt à accomplir le geste, Allâh l’interrompt par la Révélation : « Ô Ibrâhîm ! Tu as confirmé la vision. C’est ainsi que Nous récompensons les bienfaisants. » (37:104-105). Et un grand bélier descend du ciel pour le sacrifice. L’épreuve n’a jamais été dans le couteau. Elle a été dans le cœur d’Ibrâhîm — sa soumission absolue — et dans le cœur d’Ismâ’îl — sa confiance absolue. Le sacrifice ultime, Allâh ne l’a pas demandé. Il a demandé l’intention d’aller jusqu’au bout. C’est l’origine de l’Aïd al-Adha. Tu sacrifies un animal chaque année pour te rappeler ce moment où un père et un fils ont dit ensemble : « Notre vie t’appartient. »</w:t>
-      </w:r>
-    </w:p>
-    <w:p>
-      <w:pPr>
-        <w:spacing w:after="60"/>
-      </w:pPr>
-      <w:r>
-        <w:rPr>
-          <w:rFonts w:ascii="Cormorant Garamond" w:cs="Cormorant Garamond" w:eastAsia="Cormorant Garamond" w:hAnsi="Cormorant Garamond"/>
-          <w:sz w:val="22"/>
-          <w:szCs w:val="22"/>
-        </w:rPr>
-        <w:t xml:space="preserve">Allah a donné. Allah a repris. Que le nom d'Allah soit loué.</w:t>
+        <w:t xml:space="preserve">Coran 21:83-84, 38:41-44 · Tafsir Ibn Kathir · Tabari, Tarikh</w:t>
+      </w:r>
+    </w:p>
+    <w:p>
+      <w:pPr>
+        <w:spacing w:after="60"/>
+      </w:pPr>
+      <w:r>
+        <w:rPr>
+          <w:rFonts w:ascii="Cormorant Garamond" w:cs="Cormorant Garamond" w:eastAsia="Cormorant Garamond" w:hAnsi="Cormorant Garamond"/>
+          <w:sz w:val="22"/>
+          <w:szCs w:val="22"/>
+        </w:rPr>
+        <w:t xml:space="preserve">Avant l’épreuve, il y eut la grâce. Et la grâce fut immense.</w:t>
+      </w:r>
+    </w:p>
+    <w:p>
+      <w:pPr>
+        <w:spacing w:after="60"/>
+      </w:pPr>
+      <w:r>
+        <w:rPr>
+          <w:rFonts w:ascii="Cormorant Garamond" w:cs="Cormorant Garamond" w:eastAsia="Cormorant Garamond" w:hAnsi="Cormorant Garamond"/>
+          <w:sz w:val="22"/>
+          <w:szCs w:val="22"/>
+        </w:rPr>
+        <w:t xml:space="preserve">Ayyub vivait dans la terre de Hûrân, entre le Hauran et la Batanée, au sud de ce qu’on appelle aujourd’hui la Syrie. C’était un descendant d’Ibrâhîm par la lignée d’al-’Îs ibn Ishâq — un homme de sang prophétique, héritier de la foi pure. Allah l’avait choisi comme prophète parmi les siens. Et Il l’avait comblé comme Il comble ceux qu’Il veut éprouver : en leur donnant d’abord tout ce qu’un homme peut désirer.</w:t>
+      </w:r>
+    </w:p>
+    <w:p>
+      <w:pPr>
+        <w:spacing w:after="60"/>
+      </w:pPr>
+      <w:r>
+        <w:rPr>
+          <w:rFonts w:ascii="Cormorant Garamond" w:cs="Cormorant Garamond" w:eastAsia="Cormorant Garamond" w:hAnsi="Cormorant Garamond"/>
+          <w:sz w:val="22"/>
+          <w:szCs w:val="22"/>
+        </w:rPr>
+        <w:t xml:space="preserve">Ayyub possédait des terres à perte de vue. Des champs de blé, des vergers, des vignes, des oliveraies. Des troupeaux innombrables — chameaux, bœufs, moutons, chèvres — répartis sur plusieurs vallées. Des serviteurs par dizaines qui administraient ses domaines. Une maison vaste, solide, connue de toute la région. Les voyageurs la repéraient de loin et savaient qu’ils y trouveraient le gîte et le couvert, car Ayyub était célèbre pour sa générosité. Personne ne passait devant sa porte sans être nourri. Personne ne repartait les mains vides.</w:t>
+      </w:r>
+    </w:p>
+    <w:p>
+      <w:pPr>
+        <w:spacing w:after="60"/>
+      </w:pPr>
+      <w:r>
+        <w:rPr>
+          <w:rFonts w:ascii="Cormorant Garamond" w:cs="Cormorant Garamond" w:eastAsia="Cormorant Garamond" w:hAnsi="Cormorant Garamond"/>
+          <w:sz w:val="22"/>
+          <w:szCs w:val="22"/>
+        </w:rPr>
+        <w:t xml:space="preserve">Mais sa richesse la plus précieuse n’était pas dans ses greniers. Elle était dans sa maison. Sept fils et sept filles. Quatorze enfants en pleine santé, élevés dans la foi d’Ibrâhîm, instruits dans l’adoration d’Allah. Sa femme — que la tradition nomme Rahmah, ou parfois Liyâ — était une femme pieuse, patiente, attachée à son mari par un lien que rien, pensait-on, ne pourrait défaire. Le foyer d’Ayyub était un foyer de lumière.</w:t>
+      </w:r>
+    </w:p>
+    <w:p>
+      <w:pPr>
+        <w:spacing w:after="60"/>
+      </w:pPr>
+      <w:r>
+        <w:rPr>
+          <w:rFonts w:ascii="Cormorant Garamond" w:cs="Cormorant Garamond" w:eastAsia="Cormorant Garamond" w:hAnsi="Cormorant Garamond"/>
+          <w:sz w:val="22"/>
+          <w:szCs w:val="22"/>
+        </w:rPr>
+        <w:t xml:space="preserve">Et Ayyub lui-même ? Un corps vigoureux. Une santé sans faille. Un visage que la maladie n’avait jamais touché. Il priait la nuit, jeûnait le jour, donnait aux pauvres sans compter, jugeait entre les gens avec équité. Il ne passait pas devant un malheureux sans s’arrêter. Il ne voyait pas une injustice sans intervenir. Quand il se prosternait, il pleurait de gratitude. Il disait — et la tradition a retenu cette parole : « Ô Allah, Tu m’as donné ce que Tu n’as donné à personne de mon temps. Rien de tout cela ne me détournera de Toi. »</w:t>
+      </w:r>
+    </w:p>
+    <w:p>
+      <w:pPr>
+        <w:spacing w:after="60"/>
+      </w:pPr>
+      <w:r>
+        <w:rPr>
+          <w:rFonts w:ascii="Cormorant Garamond" w:cs="Cormorant Garamond" w:eastAsia="Cormorant Garamond" w:hAnsi="Cormorant Garamond"/>
+          <w:sz w:val="22"/>
+          <w:szCs w:val="22"/>
+        </w:rPr>
+        <w:t xml:space="preserve">C’est cette phrase qui attira l’attention d’Iblîs.</w:t>
+      </w:r>
+    </w:p>
+    <w:p>
+      <w:pPr>
+        <w:spacing w:after="60"/>
+      </w:pPr>
+      <w:r>
+        <w:rPr>
+          <w:rFonts w:ascii="Cormorant Garamond" w:cs="Cormorant Garamond" w:eastAsia="Cormorant Garamond" w:hAnsi="Cormorant Garamond"/>
+          <w:sz w:val="22"/>
+          <w:szCs w:val="22"/>
+        </w:rPr>
+        <w:t xml:space="preserve">Ibn Kathîr rapporte, d’après les traditions anciennes, que les anges mentionnèrent Ayyub devant Allah comme un serviteur exemplaire. Iblîs — qui écoute, qui rôde, qui cherche la faille — intervint. Il dit, selon la formulation que les exégètes ont transmise : « Ayyub ne T’adore que parce que Tu lui as tout donné. Retire-lui ses biens, et Tu verras qu’il cessera de Te remercier. »</w:t>
+      </w:r>
+    </w:p>
+    <w:p>
+      <w:pPr>
+        <w:spacing w:after="60"/>
+      </w:pPr>
+      <w:r>
+        <w:rPr>
+          <w:rFonts w:ascii="Cormorant Garamond" w:cs="Cormorant Garamond" w:eastAsia="Cormorant Garamond" w:hAnsi="Cormorant Garamond"/>
+          <w:sz w:val="22"/>
+          <w:szCs w:val="22"/>
+        </w:rPr>
+        <w:t xml:space="preserve">C’est le même argument qu’Iblîs avait formulé devant Allah au sujet de l’humanité entière le jour de la création d’Adam : les hommes ne sont fidèles que par intérêt. Retire le confort, et la foi s’effondre. Iblîs ne connaît qu’une seule thèse — et il la répète depuis le commencement du monde.</w:t>
+      </w:r>
+    </w:p>
+    <w:p>
+      <w:pPr>
+        <w:spacing w:after="60"/>
+      </w:pPr>
+      <w:r>
+        <w:rPr>
+          <w:rFonts w:ascii="Cormorant Garamond" w:cs="Cormorant Garamond" w:eastAsia="Cormorant Garamond" w:hAnsi="Cormorant Garamond"/>
+          <w:sz w:val="22"/>
+          <w:szCs w:val="22"/>
+        </w:rPr>
+        <w:t xml:space="preserve">Allah — qui connaît Ayyub mieux qu’Ayyub ne se connaît lui-même — donna à Iblîs la permission d’éprouver Ses biens. Pas son corps. Pas encore. Les biens seulement. Comme si Allah disait à Iblîs : Tu crois que la foi de Mon serviteur repose sur ce qu’il possède ? Regarde.</w:t>
+      </w:r>
+    </w:p>
+    <w:p>
+      <w:pPr>
+        <w:spacing w:after="60"/>
+      </w:pPr>
+      <w:r>
+        <w:rPr>
+          <w:rFonts w:ascii="Cormorant Garamond" w:cs="Cormorant Garamond" w:eastAsia="Cormorant Garamond" w:hAnsi="Cormorant Garamond"/>
+          <w:sz w:val="22"/>
+          <w:szCs w:val="22"/>
+        </w:rPr>
+        <w:t xml:space="preserve">Iblîs ne perdit pas un instant.</w:t>
+      </w:r>
+    </w:p>
+    <w:p>
+      <w:pPr>
+        <w:spacing w:after="60"/>
+      </w:pPr>
+      <w:r>
+        <w:rPr>
+          <w:rFonts w:ascii="Cormorant Garamond" w:cs="Cormorant Garamond" w:eastAsia="Cormorant Garamond" w:hAnsi="Cormorant Garamond"/>
+          <w:sz w:val="22"/>
+          <w:szCs w:val="22"/>
+        </w:rPr>
+        <w:t xml:space="preserve">Les troupeaux d’abord. Un incendie se déclara dans les pâturages du nord. Les chameaux périrent. Un autre feu, dans une autre vallée. Les bœufs périrent. Puis une épidémie frappa les moutons. Puis les chèvres. En quelques jours, les troupeaux d’Ayyub — ceux qui faisaient vivre des dizaines de familles, ceux qui nourrissaient les pauvres de passage — furent réduits à néant. Les bergers revinrent les mains vides, le visage défait. Ils racontèrent ce qu’ils avaient vu. Ayyub écouta. Il ne dit rien contre Allah. Il se prosterna.</w:t>
+      </w:r>
+    </w:p>
+    <w:p>
+      <w:pPr>
+        <w:spacing w:after="60"/>
+      </w:pPr>
+      <w:r>
+        <w:rPr>
+          <w:rFonts w:ascii="Cormorant Garamond" w:cs="Cormorant Garamond" w:eastAsia="Cormorant Garamond" w:hAnsi="Cormorant Garamond"/>
+          <w:sz w:val="22"/>
+          <w:szCs w:val="22"/>
+        </w:rPr>
+        <w:t xml:space="preserve">Les terres ensuite. Des inondations emportèrent les récoltes de blé. Une sécheresse brûla les vergers. Les oliveraies se desséchèrent en une saison. La terre, qui donnait sans compter depuis des décennies, cessa de donner. Comme si elle avait reçu un ordre. Les serviteurs commencèrent à partir — non par trahison, mais parce qu’il n’y avait plus rien à administrer. Les voisins, qui venaient autrefois demander conseil au riche Ayyub, cessèrent de venir. La maison qui accueillait tout le monde se vida.</w:t>
+      </w:r>
+    </w:p>
+    <w:p>
+      <w:pPr>
+        <w:spacing w:after="60"/>
+      </w:pPr>
+      <w:r>
+        <w:rPr>
+          <w:rFonts w:ascii="Cormorant Garamond" w:cs="Cormorant Garamond" w:eastAsia="Cormorant Garamond" w:hAnsi="Cormorant Garamond"/>
+          <w:sz w:val="22"/>
+          <w:szCs w:val="22"/>
+        </w:rPr>
+        <w:t xml:space="preserve">Ayyub supporta. Il dit, selon la tradition : « Allah a donné. Allah a repris. Que le nom d’Allah soit béni. » Il continua de prier. Il continua de jeûner. Il continua de louer. Iblîs observait, furieux. La thèse ne se vérifiait pas.</w:t>
+      </w:r>
+    </w:p>
+    <w:p>
+      <w:pPr>
+        <w:spacing w:after="60"/>
+      </w:pPr>
+      <w:r>
+        <w:rPr>
+          <w:rFonts w:ascii="Cormorant Garamond" w:cs="Cormorant Garamond" w:eastAsia="Cormorant Garamond" w:hAnsi="Cormorant Garamond"/>
+          <w:sz w:val="22"/>
+          <w:szCs w:val="22"/>
+        </w:rPr>
+        <w:t xml:space="preserve">Alors Iblîs frappa là où la douleur est insoutenable.</w:t>
+      </w:r>
+    </w:p>
+    <w:p>
+      <w:pPr>
+        <w:spacing w:after="60"/>
+      </w:pPr>
+      <w:r>
+        <w:rPr>
+          <w:rFonts w:ascii="Cormorant Garamond" w:cs="Cormorant Garamond" w:eastAsia="Cormorant Garamond" w:hAnsi="Cormorant Garamond"/>
+          <w:sz w:val="22"/>
+          <w:szCs w:val="22"/>
+        </w:rPr>
+        <w:t xml:space="preserve">Un jour — un seul jour —, les sept fils et les sept filles d’Ayyub étaient réunis dans la maison de l’aîné. C’était un repas de famille, un moment de joie. Le toit s’effondra sur eux. Les quatorze enfants moururent ensemble, sous les décombres, en un instant. Quatorze vies. Quatorze sourires éteints. Quatorze voix qui ne réciteraient plus le Coran le soir dans la maison de leur père.</w:t>
+      </w:r>
+    </w:p>
+    <w:p>
+      <w:pPr>
+        <w:spacing w:after="60"/>
+      </w:pPr>
+      <w:r>
+        <w:rPr>
+          <w:rFonts w:ascii="Cormorant Garamond" w:cs="Cormorant Garamond" w:eastAsia="Cormorant Garamond" w:hAnsi="Cormorant Garamond"/>
+          <w:sz w:val="22"/>
+          <w:szCs w:val="22"/>
+        </w:rPr>
+        <w:t xml:space="preserve">On vint annoncer la nouvelle à Ayyub. Il se leva. Il regarda le messager. Il ne cria pas. Il ne maudit pas. Il ne frappa pas le sol. Il prononça les mêmes mots — mais cette fois, chaque syllabe pesait le poids d’un monde englouti : « Allah a donné. Allah a repris. Que le nom d’Allah soit béni. »</w:t>
+      </w:r>
+    </w:p>
+    <w:p>
+      <w:pPr>
+        <w:spacing w:after="60"/>
+      </w:pPr>
+      <w:r>
+        <w:rPr>
+          <w:rFonts w:ascii="Cormorant Garamond" w:cs="Cormorant Garamond" w:eastAsia="Cormorant Garamond" w:hAnsi="Cormorant Garamond"/>
+          <w:sz w:val="22"/>
+          <w:szCs w:val="22"/>
+        </w:rPr>
+        <w:t xml:space="preserve">Et il se prosterna.</w:t>
+      </w:r>
+    </w:p>
+    <w:p>
+      <w:pPr>
+        <w:spacing w:after="60"/>
+      </w:pPr>
+      <w:r>
+        <w:rPr>
+          <w:rFonts w:ascii="Cormorant Garamond" w:cs="Cormorant Garamond" w:eastAsia="Cormorant Garamond" w:hAnsi="Cormorant Garamond"/>
+          <w:sz w:val="22"/>
+          <w:szCs w:val="22"/>
+        </w:rPr>
+        <w:t xml:space="preserve">Iblîs vit la prosternation. Il vit les larmes couler sur le sol. Il vit que les larmes n’étaient pas des larmes de révolte — c’étaient des larmes d’un père qui pleure ses enfants en sachant qu’ils appartiennent à Celui qui les lui avait confiés. Iblîs comprit qu’il avait perdu la première manche. Les biens n’avaient pas suffi. Les enfants n’avaient pas suffi. Ayyub tenait.</w:t>
+      </w:r>
+    </w:p>
+    <w:p>
+      <w:pPr>
+        <w:spacing w:after="60"/>
+      </w:pPr>
+      <w:r>
+        <w:rPr>
+          <w:rFonts w:ascii="Cormorant Garamond" w:cs="Cormorant Garamond" w:eastAsia="Cormorant Garamond" w:hAnsi="Cormorant Garamond"/>
+          <w:sz w:val="22"/>
+          <w:szCs w:val="22"/>
+        </w:rPr>
+        <w:t xml:space="preserve">Mais Iblîs ne s’arrête jamais. Il revint devant Allah. Il dit : « Ayyub supporte la perte de ses biens et de ses enfants parce qu’il a encore son corps. Touche son corps, et il Te maudira en face. »</w:t>
+      </w:r>
+    </w:p>
+    <w:p>
+      <w:pPr>
+        <w:spacing w:after="60"/>
+      </w:pPr>
+      <w:r>
+        <w:rPr>
+          <w:rFonts w:ascii="Cormorant Garamond" w:cs="Cormorant Garamond" w:eastAsia="Cormorant Garamond" w:hAnsi="Cormorant Garamond"/>
+          <w:sz w:val="22"/>
+          <w:szCs w:val="22"/>
+        </w:rPr>
+        <w:t xml:space="preserve">Allah donna la permission. Le corps. Pas l’âme. Pas la raison. Le corps seulement.</w:t>
+      </w:r>
+    </w:p>
+    <w:p>
+      <w:pPr>
+        <w:spacing w:after="60"/>
+      </w:pPr>
+      <w:r>
+        <w:rPr>
+          <w:rFonts w:ascii="Cormorant Garamond" w:cs="Cormorant Garamond" w:eastAsia="Cormorant Garamond" w:hAnsi="Cormorant Garamond"/>
+          <w:sz w:val="22"/>
+          <w:szCs w:val="22"/>
+        </w:rPr>
+        <w:t xml:space="preserve">Et c’est là que commence la deuxième épreuve — celle du corps, celle des sept années, celle qui fera d’Ayyub le nom même de la patience dans toutes les langues de la terre. Mais avant d’y entrer, il faut s’arrêter ici. Il faut regarder cet homme, debout dans les ruines de tout ce qu’il avait, les bras levés vers le ciel, le visage mouillé de larmes, et la bouche qui prononce encore la louange.</w:t>
+      </w:r>
+    </w:p>
+    <w:p>
+      <w:pPr>
+        <w:spacing w:after="60"/>
+      </w:pPr>
+      <w:r>
+        <w:rPr>
+          <w:rFonts w:ascii="Cormorant Garamond" w:cs="Cormorant Garamond" w:eastAsia="Cormorant Garamond" w:hAnsi="Cormorant Garamond"/>
+          <w:sz w:val="22"/>
+          <w:szCs w:val="22"/>
+        </w:rPr>
+        <w:t xml:space="preserve">C’est le moment le plus pur de l’histoire d’Ayyub. Pas la guérison. Pas la source miraculeuse. Pas le retour des biens. Non. Ce moment-ci. Celui où il a tout perdu — tout — et où il dit encore : « Que le nom d’Allah soit béni. »</w:t>
+      </w:r>
+    </w:p>
+    <w:p>
+      <w:pPr>
+        <w:spacing w:after="60"/>
+      </w:pPr>
+      <w:r>
+        <w:rPr>
+          <w:rFonts w:ascii="Cormorant Garamond" w:cs="Cormorant Garamond" w:eastAsia="Cormorant Garamond" w:hAnsi="Cormorant Garamond"/>
+          <w:sz w:val="22"/>
+          <w:szCs w:val="22"/>
+        </w:rPr>
+        <w:t xml:space="preserve">Tu te plains d’un salaire en retard. D’un projet qui échoue. D’une voiture en panne. D’un ami qui te trahit. Ayyub a enterré ses quatorze enfants en un jour. Et il s’est prosterné. Non pas parce qu’il ne souffrait pas — il souffrait comme souffre un père. Mais parce qu’il savait, au fond de son cœur de prophète, que la douleur ne change rien à la vérité. Et la vérité, c’est qu’Allah donne et qu’Allah reprend. Et que dans les deux cas, Il mérite la louange.</w:t>
+      </w:r>
+    </w:p>
+    <w:p>
+      <w:pPr>
+        <w:spacing w:after="60"/>
+      </w:pPr>
+      <w:r>
+        <w:rPr>
+          <w:rFonts w:ascii="Cormorant Garamond" w:cs="Cormorant Garamond" w:eastAsia="Cormorant Garamond" w:hAnsi="Cormorant Garamond"/>
+          <w:sz w:val="22"/>
+          <w:szCs w:val="22"/>
+        </w:rPr>
+        <w:t xml:space="preserve">Allah a donné. Allah a repris. Que le nom d’Allah soit béni.</w:t>
+      </w:r>
+    </w:p>
+    <w:p>
+      <w:pPr>
+        <w:spacing w:after="60"/>
+      </w:pPr>
+      <w:r>
+        <w:rPr>
+          <w:rFonts w:ascii="Cormorant Garamond" w:cs="Cormorant Garamond" w:eastAsia="Cormorant Garamond" w:hAnsi="Cormorant Garamond"/>
+          <w:sz w:val="22"/>
+          <w:szCs w:val="22"/>
+        </w:rPr>
+        <w:t xml:space="preserve">La richesse véritable n’est pas ce qu’on possède, mais ce qu’on reste capable de dire quand on a tout perdu. Ayyub enseigne que la louange survit à l’avoir.</w:t>
       </w:r>
     </w:p>
     <w:p>
@@ -7406,6 +8082,19 @@
     </w:p>
     <w:p>
       <w:pPr>
+        <w:spacing w:after="60"/>
+      </w:pPr>
+      <w:r>
+        <w:rPr>
+          <w:rFonts w:ascii="Cormorant Garamond" w:cs="Cormorant Garamond" w:eastAsia="Cormorant Garamond" w:hAnsi="Cormorant Garamond"/>
+          <w:sz w:val="22"/>
+          <w:szCs w:val="22"/>
+        </w:rPr>
+        <w:t xml:space="preserve">Le test n'est pas la douleur. C'est ce qu'on dit dans la douleur. Ayyub n'a pas demandé la guérison comme un dû — il a posé sa douleur aux pieds d'Allah, et Allah a fait le reste.</w:t>
+      </w:r>
+    </w:p>
+    <w:p>
+      <w:pPr>
         <w:pBdr>
           <w:bottom w:val="single" w:color="CCCCCC" w:sz="1"/>
         </w:pBdr>
@@ -7679,6 +8368,19 @@
     </w:p>
     <w:p>
       <w:pPr>
+        <w:spacing w:after="60"/>
+      </w:pPr>
+      <w:r>
+        <w:rPr>
+          <w:rFonts w:ascii="Cormorant Garamond" w:cs="Cormorant Garamond" w:eastAsia="Cormorant Garamond" w:hAnsi="Cormorant Garamond"/>
+          <w:sz w:val="22"/>
+          <w:szCs w:val="22"/>
+        </w:rPr>
+        <w:t xml:space="preserve">Certaines fidélités ne font pas d'histoire. Elles tiennent, simplement, tous les jours, sans bruit, sans témoin, sans récompense visible. Dhul-Kifl enseigne que tenir parole est en soi une voie spirituelle complète.</w:t>
+      </w:r>
+    </w:p>
+    <w:p>
+      <w:pPr>
         <w:pBdr>
           <w:bottom w:val="single" w:color="CCCCCC" w:sz="1"/>
         </w:pBdr>
@@ -7913,6 +8615,19 @@
     </w:p>
     <w:p>
       <w:pPr>
+        <w:spacing w:after="60"/>
+      </w:pPr>
+      <w:r>
+        <w:rPr>
+          <w:rFonts w:ascii="Cormorant Garamond" w:cs="Cormorant Garamond" w:eastAsia="Cormorant Garamond" w:hAnsi="Cormorant Garamond"/>
+          <w:sz w:val="22"/>
+          <w:szCs w:val="22"/>
+        </w:rPr>
+        <w:t xml:space="preserve">Même un prophète peut faiblir et fuir. Yunus part en colère, sans permission. Allah ne le punit pas par la mort — Il l'enseigne par la traversée de la nuit la plus noire.</w:t>
+      </w:r>
+    </w:p>
+    <w:p>
+      <w:pPr>
         <w:pBdr>
           <w:bottom w:val="single" w:color="CCCCCC" w:sz="1"/>
         </w:pBdr>
@@ -8251,6 +8966,19 @@
     </w:p>
     <w:p>
       <w:pPr>
+        <w:spacing w:after="60"/>
+      </w:pPr>
+      <w:r>
+        <w:rPr>
+          <w:rFonts w:ascii="Cormorant Garamond" w:cs="Cormorant Garamond" w:eastAsia="Cormorant Garamond" w:hAnsi="Cormorant Garamond"/>
+          <w:sz w:val="22"/>
+          <w:szCs w:val="22"/>
+        </w:rPr>
+        <w:t xml:space="preserve">Quand on est avalé par la nuit, il reste toujours la parole qui sauve. Yunus enseigne que la reconnaissance de sa propre injustice, sans plaidoirie ni excuse, est elle-même la prière qui ouvre Allah.</w:t>
+      </w:r>
+    </w:p>
+    <w:p>
+      <w:pPr>
         <w:pBdr>
           <w:bottom w:val="single" w:color="CCCCCC" w:sz="1"/>
         </w:pBdr>
@@ -8550,6 +9278,19 @@
     </w:p>
     <w:p>
       <w:pPr>
+        <w:spacing w:after="60"/>
+      </w:pPr>
+      <w:r>
+        <w:rPr>
+          <w:rFonts w:ascii="Cormorant Garamond" w:cs="Cormorant Garamond" w:eastAsia="Cormorant Garamond" w:hAnsi="Cormorant Garamond"/>
+          <w:sz w:val="22"/>
+          <w:szCs w:val="22"/>
+        </w:rPr>
+        <w:t xml:space="preserve">Allah écrit avec des ironies que les hommes ne perçoivent qu'à la fin. L'enfant que Pharaon devait tuer fut élevé dans son propre palais — par sa propre femme, avec son propre or, à sa propre table.</w:t>
+      </w:r>
+    </w:p>
+    <w:p>
+      <w:pPr>
         <w:pBdr>
           <w:bottom w:val="single" w:color="CCCCCC" w:sz="1"/>
         </w:pBdr>
@@ -8823,6 +9564,19 @@
     </w:p>
     <w:p>
       <w:pPr>
+        <w:spacing w:after="60"/>
+      </w:pPr>
+      <w:r>
+        <w:rPr>
+          <w:rFonts w:ascii="Cormorant Garamond" w:cs="Cormorant Garamond" w:eastAsia="Cormorant Garamond" w:hAnsi="Cormorant Garamond"/>
+          <w:sz w:val="22"/>
+          <w:szCs w:val="22"/>
+        </w:rPr>
+        <w:t xml:space="preserve">Musa apprend, dans l'erreur, ce que les princes n'apprennent jamais : la fragilité de toute action humaine. Un coup donné en colère peut suffire à tuer. Un seul.</w:t>
+      </w:r>
+    </w:p>
+    <w:p>
+      <w:pPr>
         <w:pBdr>
           <w:bottom w:val="single" w:color="CCCCCC" w:sz="1"/>
         </w:pBdr>
@@ -9096,6 +9850,19 @@
     </w:p>
     <w:p>
       <w:pPr>
+        <w:spacing w:after="60"/>
+      </w:pPr>
+      <w:r>
+        <w:rPr>
+          <w:rFonts w:ascii="Cormorant Garamond" w:cs="Cormorant Garamond" w:eastAsia="Cormorant Garamond" w:hAnsi="Cormorant Garamond"/>
+          <w:sz w:val="22"/>
+          <w:szCs w:val="22"/>
+        </w:rPr>
+        <w:t xml:space="preserve">Avant le grand combat, il y a souvent les dix années silencieuses. Allah forme Ses messagers dans la longueur du temps banal, là où personne ne regarde, par des troupeaux et des contrats simples.</w:t>
+      </w:r>
+    </w:p>
+    <w:p>
+      <w:pPr>
         <w:pBdr>
           <w:bottom w:val="single" w:color="CCCCCC" w:sz="1"/>
         </w:pBdr>
@@ -9447,6 +10214,19 @@
     </w:p>
     <w:p>
       <w:pPr>
+        <w:spacing w:after="60"/>
+      </w:pPr>
+      <w:r>
+        <w:rPr>
+          <w:rFonts w:ascii="Cormorant Garamond" w:cs="Cormorant Garamond" w:eastAsia="Cormorant Garamond" w:hAnsi="Cormorant Garamond"/>
+          <w:sz w:val="22"/>
+          <w:szCs w:val="22"/>
+        </w:rPr>
+        <w:t xml:space="preserve">Il y a des appels qui transforment un homme entier en une seconde. Musa monte chercher du feu pour sa femme — il redescend prophète d'Allah. Quand Allah convoque, la vie ordinaire devient inhabitable.</w:t>
+      </w:r>
+    </w:p>
+    <w:p>
+      <w:pPr>
         <w:pBdr>
           <w:bottom w:val="single" w:color="CCCCCC" w:sz="1"/>
         </w:pBdr>
@@ -9824,6 +10604,19 @@
     </w:p>
     <w:p>
       <w:pPr>
+        <w:spacing w:after="60"/>
+      </w:pPr>
+      <w:r>
+        <w:rPr>
+          <w:rFonts w:ascii="Cormorant Garamond" w:cs="Cormorant Garamond" w:eastAsia="Cormorant Garamond" w:hAnsi="Cormorant Garamond"/>
+          <w:sz w:val="22"/>
+          <w:szCs w:val="22"/>
+        </w:rPr>
+        <w:t xml:space="preserve">L'orgueil de Pharaon est le sommet de l'orgueil humain : il ne se contente pas d'adorer une idole, il se proclame lui-même Dieu. C'est l'ennemi le plus complet qu'un prophète puisse affronter.</w:t>
+      </w:r>
+    </w:p>
+    <w:p>
+      <w:pPr>
         <w:pBdr>
           <w:bottom w:val="single" w:color="CCCCCC" w:sz="1"/>
         </w:pBdr>
@@ -10201,6 +10994,19 @@
     </w:p>
     <w:p>
       <w:pPr>
+        <w:spacing w:after="60"/>
+      </w:pPr>
+      <w:r>
+        <w:rPr>
+          <w:rFonts w:ascii="Cormorant Garamond" w:cs="Cormorant Garamond" w:eastAsia="Cormorant Garamond" w:hAnsi="Cormorant Garamond"/>
+          <w:sz w:val="22"/>
+          <w:szCs w:val="22"/>
+        </w:rPr>
+        <w:t xml:space="preserve">Allah ouvre des chemins là où la science dit qu'il n'y en a pas. La foi consiste à avancer jusqu'au bord de la mer en faisant confiance que ce qui semble bouché s'ouvrira au moment précis du frappement.</w:t>
+      </w:r>
+    </w:p>
+    <w:p>
+      <w:pPr>
         <w:pBdr>
           <w:bottom w:val="single" w:color="CCCCCC" w:sz="1"/>
         </w:pBdr>
@@ -10474,6 +11280,19 @@
     </w:p>
     <w:p>
       <w:pPr>
+        <w:spacing w:after="60"/>
+      </w:pPr>
+      <w:r>
+        <w:rPr>
+          <w:rFonts w:ascii="Cormorant Garamond" w:cs="Cormorant Garamond" w:eastAsia="Cormorant Garamond" w:hAnsi="Cormorant Garamond"/>
+          <w:sz w:val="22"/>
+          <w:szCs w:val="22"/>
+        </w:rPr>
+        <w:t xml:space="preserve">Allah donne la Loi sur la montagne, mais le peuple peut adorer un veau dans la vallée pendant qu'on la lui apporte. La distance entre la révélation et le quotidien est le combat permanent du croyant.</w:t>
+      </w:r>
+    </w:p>
+    <w:p>
+      <w:pPr>
         <w:pBdr>
           <w:bottom w:val="single" w:color="CCCCCC" w:sz="1"/>
         </w:pBdr>
@@ -10612,7 +11431,7 @@
           <w:sz w:val="22"/>
           <w:szCs w:val="22"/>
         </w:rPr>
-        <w:t xml:space="preserve">Le Prophète Muhammad ﷺ, lors de son Ascension nocturne, rencontra Musa dans le sixième ciel. Et c'est Musa qui lui conseilla, après que Muhammad ﷺ eut reçu cinquante prières par jour pour sa communauté, de retourner vers Allah pour demander la réduction. Pas par paresse — par expérience. Musa avait vu son peuple incapable de tenir un seul commandement. Il savait que cinquante prières par jour seraient trop. Muhammad ﷺ retourna plusieurs fois. Allah finit par fixer à cinq prières, avec la récompense de cinquante. C'est par l'intercession discrète de Musa, dans le ciel, que les musulmans aujourd'hui prient cinq fois par jour au lieu de cinquante.</w:t>
+        <w:t xml:space="preserve">Le Prophète Muhammad ﷺ, lors de son Ascension nocturne, rencontra Musa dans le sixième ciel. Et c'est Musa qui lui conseilla, après que Muhammad ﷺ eut reçu cinquante prières par jour pour sa communauté, de retourner vers Allah pour demander la réduction. Pas par paresse — par expérience. Musa avait vu son peuple incapable de tenir un seul commandement. Il savait que cinquante prières par jour seraient trop. Muhammad ﷺ retourna plusieurs fois. Allah finit par fixer à cinq prières, avec la récompense de cinquante. C'est par le conseil discret de Musa, dans le ciel, que les musulmans aujourd'hui prient cinq fois par jour au lieu de cinquante.</w:t>
       </w:r>
     </w:p>
     <w:p>
@@ -10665,6 +11484,19 @@
           <w:szCs w:val="22"/>
         </w:rPr>
         <w:t xml:space="preserve">Mon Seigneur, j'ai grand besoin du bien que Tu fais descendre vers moi.</w:t>
+      </w:r>
+    </w:p>
+    <w:p>
+      <w:pPr>
+        <w:spacing w:after="60"/>
+      </w:pPr>
+      <w:r>
+        <w:rPr>
+          <w:rFonts w:ascii="Cormorant Garamond" w:cs="Cormorant Garamond" w:eastAsia="Cormorant Garamond" w:hAnsi="Cormorant Garamond"/>
+          <w:sz w:val="22"/>
+          <w:szCs w:val="22"/>
+        </w:rPr>
+        <w:t xml:space="preserve">Musa enseigne le prophète total : celui qui parle aux puissants et aux faibles, qui reçoit la Loi et la donne, qui sort un peuple de l'esclavage et apprend à supporter son ingratitude. Il meurt au seuil de la promesse, et c'est cela aussi qu'il enseigne — accepter de ne pas voir l'accomplissement.</w:t>
       </w:r>
     </w:p>
     <w:p>
@@ -10851,6 +11683,19 @@
     </w:p>
     <w:p>
       <w:pPr>
+        <w:spacing w:after="60"/>
+      </w:pPr>
+      <w:r>
+        <w:rPr>
+          <w:rFonts w:ascii="Cormorant Garamond" w:cs="Cormorant Garamond" w:eastAsia="Cormorant Garamond" w:hAnsi="Cormorant Garamond"/>
+          <w:sz w:val="22"/>
+          <w:szCs w:val="22"/>
+        </w:rPr>
+        <w:t xml:space="preserve">Harun enseigne la grandeur du second. Être prophète sans être au premier rang. Être l'appui d'un autre sans rivalité, sans amertume. Tenir le peuple pendant que le frère monte à la montagne. Choisir l'unité plutôt que la justice immédiate. Et savoir, quand on est blâmé, parler avec la voix de la mère commune plutôt que celle du droit.</w:t>
+      </w:r>
+    </w:p>
+    <w:p>
+      <w:pPr>
         <w:pBdr>
           <w:bottom w:val="single" w:color="CCCCCC" w:sz="1"/>
         </w:pBdr>
@@ -11059,6 +11904,19 @@
     </w:p>
     <w:p>
       <w:pPr>
+        <w:spacing w:after="60"/>
+      </w:pPr>
+      <w:r>
+        <w:rPr>
+          <w:rFonts w:ascii="Cormorant Garamond" w:cs="Cormorant Garamond" w:eastAsia="Cormorant Garamond" w:hAnsi="Cormorant Garamond"/>
+          <w:sz w:val="22"/>
+          <w:szCs w:val="22"/>
+        </w:rPr>
+        <w:t xml:space="preserve">Khidr enseigne d'abord que la connaissance n'a pas de bord. Que le plus grand parmi les hommes peut avoir à apprendre du plus discret. Que celui qui se croit savant doit, à un moment de sa vie, partir à pied vers un confluent qu'il ne connaît pas, derrière un homme qu'il ne connaît pas, pour réapprendre la patience devant le mystère.</w:t>
+      </w:r>
+    </w:p>
+    <w:p>
+      <w:pPr>
         <w:pBdr>
           <w:bottom w:val="single" w:color="CCCCCC" w:sz="1"/>
         </w:pBdr>
@@ -11345,6 +12203,19 @@
     </w:p>
     <w:p>
       <w:pPr>
+        <w:spacing w:after="60"/>
+      </w:pPr>
+      <w:r>
+        <w:rPr>
+          <w:rFonts w:ascii="Cormorant Garamond" w:cs="Cormorant Garamond" w:eastAsia="Cormorant Garamond" w:hAnsi="Cormorant Garamond"/>
+          <w:sz w:val="22"/>
+          <w:szCs w:val="22"/>
+        </w:rPr>
+        <w:t xml:space="preserve">Khidr enseigne que ce que nous appelons mal est parfois le visage caché du bien. Que le sabotage du bateau était sa sauvegarde. Que la mort de l'enfant était la rédemption des parents. Que le mur redressé sans salaire protégeait des orphelins qu'on ne voyait pas. La patience devant l'incompréhensible n'est pas naïveté — c'est la reconnaissance qu'il existe un point de vue plus haut que le nôtre, et que nous n'y avons pas accès.</w:t>
+      </w:r>
+    </w:p>
+    <w:p>
+      <w:pPr>
         <w:pBdr>
           <w:bottom w:val="single" w:color="CCCCCC" w:sz="1"/>
         </w:pBdr>
@@ -11470,7 +12341,7 @@
           <w:sz w:val="22"/>
           <w:szCs w:val="22"/>
         </w:rPr>
-        <w:t xml:space="preserve">On lui propose l'armure du roi. Elle est trop grande. Il l'enlève. Il garde sa fronde. Il ramasse cinq pierres lisses dans le lit du torrent. Cinq. La tradition ne dit pas pourquoi cinq. Peut-être pour Goliath et ses quatre frères, dit-on. Peut-être par prudence simple. Il avance sur la plaine. Seul. Le géant en face, les armées qui regardent.</w:t>
+        <w:t xml:space="preserve">On lui propose l'armure du roi. Elle est trop grande. Il l'enlève. Il garde sa fronde. Il ramasse cinq pierres lisses dans le lit du torrent. Cinq, selon la tradition antérieure à l'Islam. Les sources islamiques ne précisent pas le nombre exact. Peut-être pour Goliath et ses quatre frères, dit-on. Peut-être par prudence simple. Il avance sur la plaine. Seul. Le géant en face, les armées qui regardent.</w:t>
       </w:r>
     </w:p>
     <w:p>
@@ -11523,6 +12394,19 @@
           <w:szCs w:val="22"/>
         </w:rPr>
         <w:t xml:space="preserve">Tu viens contre moi avec l'épée, la lance et le javelot. Moi, je viens contre toi au nom du Seigneur des armées.</w:t>
+      </w:r>
+    </w:p>
+    <w:p>
+      <w:pPr>
+        <w:spacing w:after="60"/>
+      </w:pPr>
+      <w:r>
+        <w:rPr>
+          <w:rFonts w:ascii="Cormorant Garamond" w:cs="Cormorant Garamond" w:eastAsia="Cormorant Garamond" w:hAnsi="Cormorant Garamond"/>
+          <w:sz w:val="22"/>
+          <w:szCs w:val="22"/>
+        </w:rPr>
+        <w:t xml:space="preserve">Dawud enseigne que la victoire ne dépend pas de la taille de l'arme, mais de la justesse du regard. Cinq pierres lisses dans un torrent valent plus qu'une armure de roi quand celui qui les porte a gardé des brebis, a affronté des lions, et n'a pas oublié au nom de qui il se bat. Allah choisit ses rois parmi les bergers que les pères eux-mêmes oublient de présenter.</w:t>
       </w:r>
     </w:p>
     <w:p>
@@ -11722,6 +12606,19 @@
     </w:p>
     <w:p>
       <w:pPr>
+        <w:spacing w:after="60"/>
+      </w:pPr>
+      <w:r>
+        <w:rPr>
+          <w:rFonts w:ascii="Cormorant Garamond" w:cs="Cormorant Garamond" w:eastAsia="Cormorant Garamond" w:hAnsi="Cormorant Garamond"/>
+          <w:sz w:val="22"/>
+          <w:szCs w:val="22"/>
+        </w:rPr>
+        <w:t xml:space="preserve">Dawud enseigne le prophète qui est aussi roi, et le roi qui est aussi artisan. Que la grandeur politique n'a de valeur qu'adossée à la prière de la nuit, au jeûne du jour sur deux, et à la cotte de mailles forgée de ses mains. La meilleure nourriture est celle de l'œuvre de ses mains. La meilleure prière est celle de la nuit partagée avec les montagnes.</w:t>
+      </w:r>
+    </w:p>
+    <w:p>
+      <w:pPr>
         <w:pBdr>
           <w:bottom w:val="single" w:color="CCCCCC" w:sz="1"/>
         </w:pBdr>
@@ -11956,6 +12853,19 @@
     </w:p>
     <w:p>
       <w:pPr>
+        <w:spacing w:after="60"/>
+      </w:pPr>
+      <w:r>
+        <w:rPr>
+          <w:rFonts w:ascii="Cormorant Garamond" w:cs="Cormorant Garamond" w:eastAsia="Cormorant Garamond" w:hAnsi="Cormorant Garamond"/>
+          <w:sz w:val="22"/>
+          <w:szCs w:val="22"/>
+        </w:rPr>
+        <w:t xml:space="preserve">Dawud enseigne, dans cet épisode-ci, le repentir du juste. Pas le repentir du criminel — qui est nécessaire mais facile. Le repentir du juge qui a jugé trop vite. Du roi qui n'a écouté qu'une seule partie. La hâte est une faute. Et la grandeur d'un homme ne se mesure pas à ce qu'il ne commet jamais, mais à la profondeur avec laquelle il se redresse quand il a manqué le meilleur.</w:t>
+      </w:r>
+    </w:p>
+    <w:p>
+      <w:pPr>
         <w:pBdr>
           <w:bottom w:val="single" w:color="CCCCCC" w:sz="1"/>
         </w:pBdr>
@@ -12177,6 +13087,19 @@
     </w:p>
     <w:p>
       <w:pPr>
+        <w:spacing w:after="60"/>
+      </w:pPr>
+      <w:r>
+        <w:rPr>
+          <w:rFonts w:ascii="Cormorant Garamond" w:cs="Cormorant Garamond" w:eastAsia="Cormorant Garamond" w:hAnsi="Cormorant Garamond"/>
+          <w:sz w:val="22"/>
+          <w:szCs w:val="22"/>
+        </w:rPr>
+        <w:t xml:space="preserve">Sulayman enseigne dès l'enfance que la justice n'est pas l'égalité mécanique des pertes — c'est la restauration patiente du bien. Replanter le champ. Faire vivre les moutons. Rendre à chacun le sien après que la vie ait été remise en marche. Et il enseigne, à l'âge du royaume, qu'on peut demander à Allah l'extraordinaire — non pour la jouissance, mais pour que ce qu'on a entre les mains soit visiblement de Lui.</w:t>
+      </w:r>
+    </w:p>
+    <w:p>
+      <w:pPr>
         <w:pBdr>
           <w:bottom w:val="single" w:color="CCCCCC" w:sz="1"/>
         </w:pBdr>
@@ -12450,6 +13373,19 @@
     </w:p>
     <w:p>
       <w:pPr>
+        <w:spacing w:after="60"/>
+      </w:pPr>
+      <w:r>
+        <w:rPr>
+          <w:rFonts w:ascii="Cormorant Garamond" w:cs="Cormorant Garamond" w:eastAsia="Cormorant Garamond" w:hAnsi="Cormorant Garamond"/>
+          <w:sz w:val="22"/>
+          <w:szCs w:val="22"/>
+        </w:rPr>
+        <w:t xml:space="preserve">Sulayman enseigne que la grandeur est dangereuse pour ce qu'elle ne voit pas — d'où la prière de la fourmi : remercier pour le don, non pour s'en glorifier, mais pour ne pas écraser sans s'en rendre compte. Il enseigne aussi qu'un roi qui ne se laisse pas acheter par l'or est un roi qui parle au nom d'autre chose que de lui-même. Le Bismillah, écrit par Sulayman, est la signature de tout pouvoir qui ne se confond pas avec son trône.</w:t>
+      </w:r>
+    </w:p>
+    <w:p>
+      <w:pPr>
         <w:pBdr>
           <w:bottom w:val="single" w:color="CCCCCC" w:sz="1"/>
         </w:pBdr>
@@ -12684,6 +13620,19 @@
     </w:p>
     <w:p>
       <w:pPr>
+        <w:spacing w:after="60"/>
+      </w:pPr>
+      <w:r>
+        <w:rPr>
+          <w:rFonts w:ascii="Cormorant Garamond" w:cs="Cormorant Garamond" w:eastAsia="Cormorant Garamond" w:hAnsi="Cormorant Garamond"/>
+          <w:sz w:val="22"/>
+          <w:szCs w:val="22"/>
+        </w:rPr>
+        <w:t xml:space="preserve">Sulayman enseigne que le miracle n'est pas le but, mais l'épreuve. Recevoir un trône en un clin d'œil est une faveur — la question est : serai-je reconnaissant ou ingrat ? Et il enseigne, à travers le sol de cristal, que les vraies conversions ne viennent pas toujours par les grandes preuves, mais par un petit moment où l'on découvre que nos yeux nous trompent — et que ce qu'on croyait solide n'est qu'un reflet.</w:t>
+      </w:r>
+    </w:p>
+    <w:p>
+      <w:pPr>
         <w:pBdr>
           <w:bottom w:val="single" w:color="CCCCCC" w:sz="1"/>
         </w:pBdr>
@@ -12918,6 +13867,19 @@
     </w:p>
     <w:p>
       <w:pPr>
+        <w:spacing w:after="60"/>
+      </w:pPr>
+      <w:r>
+        <w:rPr>
+          <w:rFonts w:ascii="Cormorant Garamond" w:cs="Cormorant Garamond" w:eastAsia="Cormorant Garamond" w:hAnsi="Cormorant Garamond"/>
+          <w:sz w:val="22"/>
+          <w:szCs w:val="22"/>
+        </w:rPr>
+        <w:t xml:space="preserve">Sulayman enseigne, par sa mort même, que la grandeur la plus haute ne dispense pas de l'humilité devant l'invisible. Le roi du vent et des djinns meurt debout, et c'est un ver de bois qui révèle sa mort. Aucun pouvoir ne survit au plus petit instrument d'Allah quand l'heure est venue. La connaissance qu'on s'attribue n'est jamais complète. Seul Lui sait l'invisible.</w:t>
+      </w:r>
+    </w:p>
+    <w:p>
+      <w:pPr>
         <w:pBdr>
           <w:bottom w:val="single" w:color="CCCCCC" w:sz="1"/>
         </w:pBdr>
@@ -13139,6 +14101,19 @@
     </w:p>
     <w:p>
       <w:pPr>
+        <w:spacing w:after="60"/>
+      </w:pPr>
+      <w:r>
+        <w:rPr>
+          <w:rFonts w:ascii="Cormorant Garamond" w:cs="Cormorant Garamond" w:eastAsia="Cormorant Garamond" w:hAnsi="Cormorant Garamond"/>
+          <w:sz w:val="22"/>
+          <w:szCs w:val="22"/>
+        </w:rPr>
+        <w:t xml:space="preserve">Ilyas enseigne le prophète qui tient seul contre une cour. Quand le palais entier mange à la table d'une idole importée, il faut un homme rude, vêtu de poils, descendu du désert, pour rappeler que les pères n'ont pas marché derrière Baal. La fidélité n'est pas un compromis. On ne boite pas sur deux jambes — on en choisit une, et on se tient debout.</w:t>
+      </w:r>
+    </w:p>
+    <w:p>
+      <w:pPr>
         <w:pBdr>
           <w:bottom w:val="single" w:color="CCCCCC" w:sz="1"/>
         </w:pBdr>
@@ -13347,6 +14322,19 @@
     </w:p>
     <w:p>
       <w:pPr>
+        <w:spacing w:after="60"/>
+      </w:pPr>
+      <w:r>
+        <w:rPr>
+          <w:rFonts w:ascii="Cormorant Garamond" w:cs="Cormorant Garamond" w:eastAsia="Cormorant Garamond" w:hAnsi="Cormorant Garamond"/>
+          <w:sz w:val="22"/>
+          <w:szCs w:val="22"/>
+        </w:rPr>
+        <w:t xml:space="preserve">Al-Yasa enseigne le prophète sans biographie. La fidélité au manteau du maître. La continuation patiente d'une mission qui n'aura pas son chapitre. Il y a des saintetés que le silence protège mieux qu'un livre entier. Et tous ceux qui font une œuvre dont personne ne parlera sont, à leur mesure, dans la même lignée que cet homme dont le Coran ne dit que le nom — et qui figure pourtant parmi les meilleurs des mondes.</w:t>
+      </w:r>
+    </w:p>
+    <w:p>
+      <w:pPr>
         <w:pBdr>
           <w:bottom w:val="single" w:color="CCCCCC" w:sz="1"/>
         </w:pBdr>
@@ -13711,6 +14699,19 @@
     </w:p>
     <w:p>
       <w:pPr>
+        <w:spacing w:after="60"/>
+      </w:pPr>
+      <w:r>
+        <w:rPr>
+          <w:rFonts w:ascii="Cormorant Garamond" w:cs="Cormorant Garamond" w:eastAsia="Cormorant Garamond" w:hAnsi="Cormorant Garamond"/>
+          <w:sz w:val="22"/>
+          <w:szCs w:val="22"/>
+        </w:rPr>
+        <w:t xml:space="preserve">Uzayr, ou le passant des ruines, enseigne que le doute sincère du croyant n'est pas une faute — c'est une porte. Allah ne punit pas la question : comment ferais-Tu revivre cela ? Il y répond par un signe. Cent ans de sommeil pour un instant de question. Une nourriture intacte et un âne ressuscité. Et la phrase qu'on retient toute sa vie : je sais qu'Allah est, sur toute chose, omnipotent.</w:t>
+      </w:r>
+    </w:p>
+    <w:p>
+      <w:pPr>
         <w:pBdr>
           <w:bottom w:val="single" w:color="CCCCCC" w:sz="1"/>
         </w:pBdr>
@@ -13932,6 +14933,19 @@
     </w:p>
     <w:p>
       <w:pPr>
+        <w:spacing w:after="60"/>
+      </w:pPr>
+      <w:r>
+        <w:rPr>
+          <w:rFonts w:ascii="Cormorant Garamond" w:cs="Cormorant Garamond" w:eastAsia="Cormorant Garamond" w:hAnsi="Cormorant Garamond"/>
+          <w:sz w:val="22"/>
+          <w:szCs w:val="22"/>
+        </w:rPr>
+        <w:t xml:space="preserve">Luqman enseigne que la sagesse n'est pas la science des grands. C'est la discipline des ordinaires : dire vrai, rendre ce qu'on a emprunté, ne pas se mêler de ce qui n'est pas le sien. Et il enseigne que ce don passe par la gratitude — sois reconnaissant — comme l'ingratitude est l'origine de toutes les sottises. La sagesse n'est pas dans les livres. Elle est dans la langue qu'on tient, ou qu'on lâche.</w:t>
+      </w:r>
+    </w:p>
+    <w:p>
+      <w:pPr>
         <w:pBdr>
           <w:bottom w:val="single" w:color="CCCCCC" w:sz="1"/>
         </w:pBdr>
@@ -14166,6 +15180,19 @@
     </w:p>
     <w:p>
       <w:pPr>
+        <w:spacing w:after="60"/>
+      </w:pPr>
+      <w:r>
+        <w:rPr>
+          <w:rFonts w:ascii="Cormorant Garamond" w:cs="Cormorant Garamond" w:eastAsia="Cormorant Garamond" w:hAnsi="Cormorant Garamond"/>
+          <w:sz w:val="22"/>
+          <w:szCs w:val="22"/>
+        </w:rPr>
+        <w:t xml:space="preserve">Luqman enseigne que la sagesse se transmet d'abord dans le foyer. Pas dans la chaire. Pas dans l'école. Dans la voix d'un père qui appelle son enfant par un diminutif d'affection, et qui lui donne, en peu de mots, ce qu'il faudra pour traverser une vie. Le tawhid d'abord. La piété filiale. La conscience du grain. La prière. L'ordre du bien. La patience. Le respect des visages. La démarche humble. Et la voix basse. Le Coran lui-même a élevé ce testament au rang de chapitre du Livre.</w:t>
+      </w:r>
+    </w:p>
+    <w:p>
+      <w:pPr>
         <w:pBdr>
           <w:bottom w:val="single" w:color="CCCCCC" w:sz="1"/>
         </w:pBdr>
@@ -14361,6 +15388,19 @@
     </w:p>
     <w:p>
       <w:pPr>
+        <w:spacing w:after="60"/>
+      </w:pPr>
+      <w:r>
+        <w:rPr>
+          <w:rFonts w:ascii="Cormorant Garamond" w:cs="Cormorant Garamond" w:eastAsia="Cormorant Garamond" w:hAnsi="Cormorant Garamond"/>
+          <w:sz w:val="22"/>
+          <w:szCs w:val="22"/>
+        </w:rPr>
+        <w:t xml:space="preserve">Dhul-Qarnayn enseigne que le pouvoir, même donné par Allah, garde sa liberté de jugement. La justice n'est pas un programme. C'est une décision qui se prend en regardant l'homme devant soi : punir le coupable, récompenser le juste, et — détail souvent oublié — donner aux justes des ordres faciles à exécuter. Le roi juste n'écrase pas. Il allège.</w:t>
+      </w:r>
+    </w:p>
+    <w:p>
+      <w:pPr>
         <w:pBdr>
           <w:bottom w:val="single" w:color="CCCCCC" w:sz="1"/>
         </w:pBdr>
@@ -14595,6 +15635,19 @@
     </w:p>
     <w:p>
       <w:pPr>
+        <w:spacing w:after="60"/>
+      </w:pPr>
+      <w:r>
+        <w:rPr>
+          <w:rFonts w:ascii="Cormorant Garamond" w:cs="Cormorant Garamond" w:eastAsia="Cormorant Garamond" w:hAnsi="Cormorant Garamond"/>
+          <w:sz w:val="22"/>
+          <w:szCs w:val="22"/>
+        </w:rPr>
+        <w:t xml:space="preserve">Dhul-Qarnayn enseigne, dans son acte le plus grand, l'humilité du bâtisseur. Refuser le tribut. Demander aux hommes leur force, pas leur or. Bâtir avec eux, pas pour eux. Et, au moment d'avoir fini la plus grande œuvre de sa vie, dire : ceci tombera. Allah le réduira en miettes quand Il le voudra. Aucun monument n'est éternel. Le tyran signe ses murs. Le juste les attribue à Celui qui les fera tomber.</w:t>
+      </w:r>
+    </w:p>
+    <w:p>
+      <w:pPr>
         <w:pBdr>
           <w:bottom w:val="single" w:color="CCCCCC" w:sz="1"/>
         </w:pBdr>
@@ -14829,6 +15882,19 @@
     </w:p>
     <w:p>
       <w:pPr>
+        <w:spacing w:after="60"/>
+      </w:pPr>
+      <w:r>
+        <w:rPr>
+          <w:rFonts w:ascii="Cormorant Garamond" w:cs="Cormorant Garamond" w:eastAsia="Cormorant Garamond" w:hAnsi="Cormorant Garamond"/>
+          <w:sz w:val="22"/>
+          <w:szCs w:val="22"/>
+        </w:rPr>
+        <w:t xml:space="preserve">Zakariyya enseigne la prière qui naît du regard. Voir Maryam recevoir le raisin en hiver, et en tirer cette espérance — si Tu fais cela pour elle, fais aussi pour moi. Le croyant ne prie pas seulement à partir de sa propre demande. Il prie à partir de ce qu'il a vu de la générosité d'Allah envers d'autres. Et il décrit sa vieillesse non comme un naufrage mais comme un incendie tendre — ma tête s'enflamme de blancheur.</w:t>
+      </w:r>
+    </w:p>
+    <w:p>
+      <w:pPr>
         <w:pBdr>
           <w:bottom w:val="single" w:color="CCCCCC" w:sz="1"/>
         </w:pBdr>
@@ -15050,6 +16116,19 @@
     </w:p>
     <w:p>
       <w:pPr>
+        <w:spacing w:after="60"/>
+      </w:pPr>
+      <w:r>
+        <w:rPr>
+          <w:rFonts w:ascii="Cormorant Garamond" w:cs="Cormorant Garamond" w:eastAsia="Cormorant Garamond" w:hAnsi="Cormorant Garamond"/>
+          <w:sz w:val="22"/>
+          <w:szCs w:val="22"/>
+        </w:rPr>
+        <w:t xml:space="preserve">Zakariyya enseigne la prière exaucée tardivement. Le vieil homme à qui Allah donne un enfant quand tout semblait fini. Et il enseigne aussi le silence d'avant la promesse — trois jours sans parler aux hommes, à seule fin que la voix d'Allah résonne mieux dans le cœur de celui qui attend. La promesse vient quand on a appris à se taire devant elle.</w:t>
+      </w:r>
+    </w:p>
+    <w:p>
+      <w:pPr>
         <w:pBdr>
           <w:bottom w:val="single" w:color="CCCCCC" w:sz="1"/>
         </w:pBdr>
@@ -15245,6 +16324,19 @@
     </w:p>
     <w:p>
       <w:pPr>
+        <w:spacing w:after="60"/>
+      </w:pPr>
+      <w:r>
+        <w:rPr>
+          <w:rFonts w:ascii="Cormorant Garamond" w:cs="Cormorant Garamond" w:eastAsia="Cormorant Garamond" w:hAnsi="Cormorant Garamond"/>
+          <w:sz w:val="22"/>
+          <w:szCs w:val="22"/>
+        </w:rPr>
+        <w:t xml:space="preserve">Yahya enseigne que certains dons sont donnés avant qu'on les ait mérités. La sagesse à un enfant. La tendresse à un cœur qui n'a pas encore souffert. La pureté à un âge où d'autres se cherchent. Et que ces dons, loin de dispenser de l'ordinaire, le sanctifient — Yahya, qui avait reçu la hukma dès l'enfance, restait néanmoins serviteur de ses parents jusqu'au dernier jour.</w:t>
+      </w:r>
+    </w:p>
+    <w:p>
+      <w:pPr>
         <w:pBdr>
           <w:bottom w:val="single" w:color="CCCCCC" w:sz="1"/>
         </w:pBdr>
@@ -15435,19 +16527,6 @@
           <w:sz w:val="22"/>
           <w:szCs w:val="22"/>
         </w:rPr>
-        <w:t xml:space="preserve">La tradition rapporte aussi que le sang de Yahya continua à bouillir, longtemps après sa mort, dans le sol où il avait coulé. On dit que, des décennies plus tard, lors de l'invasion babylonienne ou perse selon les versions, c'est en voyant ce sang qui ne s'arrêtait pas de bouillir que les envahisseurs comprirent qu'un crime immense avait été commis dans cette ville, et qu'il fallait, pour apaiser le sol, qu'un grand nombre des descendants des meurtriers soient eux-mêmes mis à mort.</w:t>
-      </w:r>
-    </w:p>
-    <w:p>
-      <w:pPr>
-        <w:spacing w:after="60"/>
-      </w:pPr>
-      <w:r>
-        <w:rPr>
-          <w:rFonts w:ascii="Cormorant Garamond" w:cs="Cormorant Garamond" w:eastAsia="Cormorant Garamond" w:hAnsi="Cormorant Garamond"/>
-          <w:sz w:val="22"/>
-          <w:szCs w:val="22"/>
-        </w:rPr>
         <w:t xml:space="preserve">Ces détails-là proviennent de la tradition exégétique et des récits postérieurs. Ils sont à signaler comme tels. Ce qu'on doit retenir, c'est ce que le Coran lui-même fait pour Yahya : la formule qu'on lit dans la sourate Maryam, et qui ne s'applique qu'à lui et à Isa parmi les fils d'Israël. Que la paix soit sur lui le jour où il est né, le jour où il mourra, et le jour où il sera ressuscité.</w:t>
       </w:r>
     </w:p>
@@ -15475,6 +16554,19 @@
           <w:szCs w:val="22"/>
         </w:rPr>
         <w:t xml:space="preserve">Il ne t'est pas permis d'épouser le frère de ton mari.</w:t>
+      </w:r>
+    </w:p>
+    <w:p>
+      <w:pPr>
+        <w:spacing w:after="60"/>
+      </w:pPr>
+      <w:r>
+        <w:rPr>
+          <w:rFonts w:ascii="Cormorant Garamond" w:cs="Cormorant Garamond" w:eastAsia="Cormorant Garamond" w:hAnsi="Cormorant Garamond"/>
+          <w:sz w:val="22"/>
+          <w:szCs w:val="22"/>
+        </w:rPr>
+        <w:t xml:space="preserve">Yahya enseigne le prophète qui meurt pour avoir dit non. Pas non à Allah. Non au roi. Non au mariage illicite. Non à l'humiliation de la Loi. Sa tête tomba sur un plateau pour avoir refusé de se taire. Et le Coran couvre de trois paix cette mort que les hommes prirent pour une déchéance, mais qu'Allah scella comme un martyre. La vraie grandeur d'une voix se mesure à ce qu'elle refuse, pas à ce qu'elle promet.</w:t>
       </w:r>
     </w:p>
     <w:p>
@@ -15700,6 +16792,19 @@
     </w:p>
     <w:p>
       <w:pPr>
+        <w:spacing w:after="60"/>
+      </w:pPr>
+      <w:r>
+        <w:rPr>
+          <w:rFonts w:ascii="Cormorant Garamond" w:cs="Cormorant Garamond" w:eastAsia="Cormorant Garamond" w:hAnsi="Cormorant Garamond"/>
+          <w:sz w:val="22"/>
+          <w:szCs w:val="22"/>
+        </w:rPr>
+        <w:t xml:space="preserve">Maryam enseigne d'abord que l'élection vient parfois avant le mérite. Une fillette qui n'a rien fait reçoit, dans son mihrab, des fruits hors saison — et comprend, sans qu'on le lui ait enseigné, qu'Allah donne sans compter. La générosité divine n'est pas une récompense. C'est un don. Et la plus grande sagesse, qu'on peut acquérir dès l'enfance, c'est de le reconnaître.</w:t>
+      </w:r>
+    </w:p>
+    <w:p>
+      <w:pPr>
         <w:pBdr>
           <w:bottom w:val="single" w:color="CCCCCC" w:sz="1"/>
         </w:pBdr>
@@ -15960,6 +17065,19 @@
     </w:p>
     <w:p>
       <w:pPr>
+        <w:spacing w:after="60"/>
+      </w:pPr>
+      <w:r>
+        <w:rPr>
+          <w:rFonts w:ascii="Cormorant Garamond" w:cs="Cormorant Garamond" w:eastAsia="Cormorant Garamond" w:hAnsi="Cormorant Garamond"/>
+          <w:sz w:val="22"/>
+          <w:szCs w:val="22"/>
+        </w:rPr>
+        <w:t xml:space="preserve">Maryam enseigne, dans cette scène, la défense la plus haute d'une femme : invoquer Allah, en appelant à la piété de l'autre. Et elle enseigne, par sa double négation devant l'ange, que la dignité d'une femme se défend même avant que le monde ne l'ait accusée. Aucun homme ne m'a touchée. Je n'ai pas été une femme de mauvaise vie. Deux phrases pour devancer toute la rumeur qui allait suivre.</w:t>
+      </w:r>
+    </w:p>
+    <w:p>
+      <w:pPr>
         <w:pBdr>
           <w:bottom w:val="single" w:color="CCCCCC" w:sz="1"/>
         </w:pBdr>
@@ -16259,6 +17377,19 @@
     </w:p>
     <w:p>
       <w:pPr>
+        <w:spacing w:after="60"/>
+      </w:pPr>
+      <w:r>
+        <w:rPr>
+          <w:rFonts w:ascii="Cormorant Garamond" w:cs="Cormorant Garamond" w:eastAsia="Cormorant Garamond" w:hAnsi="Cormorant Garamond"/>
+          <w:sz w:val="22"/>
+          <w:szCs w:val="22"/>
+        </w:rPr>
+        <w:t xml:space="preserve">Maryam enseigne le silence comme défense. Quand l'accusation tombe, ne pas répondre. Laisser Allah envoyer Son défenseur, fût-ce un nouveau-né. Et elle enseigne aussi que la grandeur spirituelle n'efface pas la douleur humaine — la plus haute des femmes pleure et voudrait être morte, sous un palmier, dans la solitude. Et Allah lui répond non par la doctrine, mais par des dattes et un ruisseau. Mange. Bois. Que ton œil se rafraîchisse.</w:t>
+      </w:r>
+    </w:p>
+    <w:p>
+      <w:pPr>
         <w:pBdr>
           <w:bottom w:val="single" w:color="CCCCCC" w:sz="1"/>
         </w:pBdr>
@@ -16441,6 +17572,19 @@
     </w:p>
     <w:p>
       <w:pPr>
+        <w:spacing w:after="60"/>
+      </w:pPr>
+      <w:r>
+        <w:rPr>
+          <w:rFonts w:ascii="Cormorant Garamond" w:cs="Cormorant Garamond" w:eastAsia="Cormorant Garamond" w:hAnsi="Cormorant Garamond"/>
+          <w:sz w:val="22"/>
+          <w:szCs w:val="22"/>
+        </w:rPr>
+        <w:t xml:space="preserve">Isa enseigne, dès son premier mot dans le berceau, ce qui sera le programme de toute sa mission : il est serviteur, pas Seigneur. Et tous ses miracles seront par la permission d'Allah, jamais de lui-même. La grandeur d'Isa, dans l'Islam, n'est pas dans son rang divin — il n'en a pas. Elle est dans le fait que cet homme, qui aurait pu, par les signes qu'il portait, se laisser appeler dieu, s'est lui-même nommé serviteur dès la première seconde de sa parole.</w:t>
+      </w:r>
+    </w:p>
+    <w:p>
+      <w:pPr>
         <w:pBdr>
           <w:bottom w:val="single" w:color="CCCCCC" w:sz="1"/>
         </w:pBdr>
@@ -16675,6 +17819,19 @@
     </w:p>
     <w:p>
       <w:pPr>
+        <w:spacing w:after="60"/>
+      </w:pPr>
+      <w:r>
+        <w:rPr>
+          <w:rFonts w:ascii="Cormorant Garamond" w:cs="Cormorant Garamond" w:eastAsia="Cormorant Garamond" w:hAnsi="Cormorant Garamond"/>
+          <w:sz w:val="22"/>
+          <w:szCs w:val="22"/>
+        </w:rPr>
+        <w:t xml:space="preserve">Isa enseigne que les signes les plus rares — souffler la vie dans l'argile, guérir l'aveugle-né, ressusciter un mort — ne sont rien sans la formule qui les conclut : par la permission d'Allah. Aucun miracle n'appartient au prophète. Et il enseigne aussi que la mission ne se porte pas seul. Il y a, dans toute œuvre, ceux qui répondent : nous sommes les auxiliaires d'Allah. Ce mot — ansar — traversera les siècles jusqu'à Médine.</w:t>
+      </w:r>
+    </w:p>
+    <w:p>
+      <w:pPr>
         <w:pBdr>
           <w:bottom w:val="single" w:color="CCCCCC" w:sz="1"/>
         </w:pBdr>
@@ -16948,6 +18105,19 @@
     </w:p>
     <w:p>
       <w:pPr>
+        <w:spacing w:after="60"/>
+      </w:pPr>
+      <w:r>
+        <w:rPr>
+          <w:rFonts w:ascii="Cormorant Garamond" w:cs="Cormorant Garamond" w:eastAsia="Cormorant Garamond" w:hAnsi="Cormorant Garamond"/>
+          <w:sz w:val="22"/>
+          <w:szCs w:val="22"/>
+        </w:rPr>
+        <w:t xml:space="preserve">Isa enseigne que demander un signe quand on en a déjà tant reçu n'est pas neutre — c'est une demande qui engage. Et il enseigne, par sa réponse au Jour du Jugement, que le vrai serviteur ne plaide pas pour lui-même. Il s'en remet à la science d'Allah : Tu sais ce que j'ai dit. Tu sais ce que je n'ai pas dit. Et il refuse, par-dessus les siècles, toute divinité qu'on aurait voulu lui prêter.</w:t>
+      </w:r>
+    </w:p>
+    <w:p>
+      <w:pPr>
         <w:pBdr>
           <w:bottom w:val="single" w:color="CCCCCC" w:sz="1"/>
         </w:pBdr>
@@ -17208,6 +18378,19 @@
     </w:p>
     <w:p>
       <w:pPr>
+        <w:spacing w:after="60"/>
+      </w:pPr>
+      <w:r>
+        <w:rPr>
+          <w:rFonts w:ascii="Cormorant Garamond" w:cs="Cormorant Garamond" w:eastAsia="Cormorant Garamond" w:hAnsi="Cormorant Garamond"/>
+          <w:sz w:val="22"/>
+          <w:szCs w:val="22"/>
+        </w:rPr>
+        <w:t xml:space="preserve">Isa enseigne, par la non-mort qui clôt sa vie terrestre, que la fin d'un prophète n'appartient qu'à Allah. Les hommes complotent. Allah dispose. Le piège des notables se referme sur autre chose. Et Isa, sans mourir, est élevé vers Celui qui l'avait envoyé. C'est une leçon pour tous ceux qui croient qu'on peut faire taire un envoyé d'Allah par une croix ou par un cachot. On ne peut pas. Allah le reprend, intact, vers Lui.</w:t>
+      </w:r>
+    </w:p>
+    <w:p>
+      <w:pPr>
         <w:pBdr>
           <w:bottom w:val="single" w:color="CCCCCC" w:sz="1"/>
         </w:pBdr>
@@ -17403,6 +18586,19 @@
     </w:p>
     <w:p>
       <w:pPr>
+        <w:spacing w:after="60"/>
+      </w:pPr>
+      <w:r>
+        <w:rPr>
+          <w:rFonts w:ascii="Cormorant Garamond" w:cs="Cormorant Garamond" w:eastAsia="Cormorant Garamond" w:hAnsi="Cormorant Garamond"/>
+          <w:sz w:val="22"/>
+          <w:szCs w:val="22"/>
+        </w:rPr>
+        <w:t xml:space="preserve">Isa enseigne la fonction du prophète qui prépare un autre. Pas le dernier maillon, mais le pénultième. Celui qui confirme Musa devant lui, et annonce Muhammad ﷺ après lui. Cette humilité dans la chaîne — savoir qu'on n'est pas la fin, mais un anneau — est, pour l'Islam, une des plus grandes leçons. Et Isa, qu'on a élevé contre sa propre parole au rang de Dieu, témoignera lui-même, au Jour du Jugement : je ne leur ai dit que ce que Tu m'as ordonné de dire.</w:t>
+      </w:r>
+    </w:p>
+    <w:p>
+      <w:pPr>
         <w:pBdr>
           <w:bottom w:val="single" w:color="CCCCCC" w:sz="1"/>
         </w:pBdr>
@@ -17490,6 +18686,19 @@
           <w:szCs w:val="22"/>
         </w:rPr>
         <w:t xml:space="preserve">Allah et Ses anges prient sur le Prophète. Ô vous qui croyez, priez sur lui et adressez-lui vos salutations.</w:t>
+      </w:r>
+    </w:p>
+    <w:p>
+      <w:pPr>
+        <w:spacing w:after="60"/>
+      </w:pPr>
+      <w:r>
+        <w:rPr>
+          <w:rFonts w:ascii="Cormorant Garamond" w:cs="Cormorant Garamond" w:eastAsia="Cormorant Garamond" w:hAnsi="Cormorant Garamond"/>
+          <w:sz w:val="22"/>
+          <w:szCs w:val="22"/>
+        </w:rPr>
+        <w:t xml:space="preserve">Le Sceau des prophètes mérite plus que quelques pages. Sa vie est, dans Niyyah, un parcours à part — une année de compagnie quotidienne avec celui qu'Allah a envoyé en miséricorde pour les mondes.</w:t>
       </w:r>
     </w:p>
     <w:p>

</xml_diff>